<commit_message>
docs: update Ratcliff briefs with repaired Model B validation
</commit_message>
<xml_diff>
--- a/docs/briefs/2026-10-15-model-b/Model_B_Methods_and_Validation_Report.docx
+++ b/docs/briefs/2026-10-15-model-b/Model_B_Methods_and_Validation_Report.docx
@@ -32,7 +32,7 @@
         <w:rPr>
           <w:b w:val="0"/>
         </w:rPr>
-        <w:t>This report explains the existing Model B acceleration, our early-stopping extension, the measured gains and the evidence still needed for a paper. The strongest new result is approximately 10.9-fold faster warmed forward simulation on an H100 at the tested parameters. That result is supported by a paired correctness control and a second GPU study. Accurate fitting faster has not yet been established.</w:t>
+        <w:t>This report explains the existing Model B acceleration, our early-stopping extension, the measured gains and the evidence still needed for a paper. The strongest new result is approximately 10.9-fold faster warmed forward simulation on an H100 at the tested parameters. That result is supported by a paired correctness control and a second GPU study. A later repaired K-L laptop fit returned 4.59% mean active-parameter error from an 8.69% start. That met the recovery target for one case, while both arms missed the provisional prediction gate. Faster fitting at jointly acceptable quality remains unproven. [10]</w:t>
       </w:r>
     </w:p>
     <w:p>
@@ -1366,6 +1366,142 @@
           </w:p>
         </w:tc>
       </w:tr>
+      <w:tr>
+        <w:trPr>
+          <w:cantSplit/>
+        </w:trPr>
+        <w:tc>
+          <w:tcPr>
+            <w:tcW w:type="dxa" w:w="4680"/>
+            <w:vAlign w:val="center"/>
+            <w:tcBorders>
+              <w:top w:val="single" w:sz="5" w:color="D9D9D9"/>
+              <w:left w:val="single" w:sz="5" w:color="D9D9D9"/>
+              <w:bottom w:val="single" w:sz="5" w:color="D9D9D9"/>
+              <w:right w:val="single" w:sz="5" w:color="D9D9D9"/>
+            </w:tcBorders>
+            <w:shd w:fill="F3F5F6"/>
+            <w:tcMar>
+              <w:top w:w="70" w:type="dxa"/>
+              <w:bottom w:w="70" w:type="dxa"/>
+              <w:left w:w="90" w:type="dxa"/>
+              <w:right w:w="90" w:type="dxa"/>
+            </w:tcMar>
+          </w:tcPr>
+          <w:p>
+            <w:pPr>
+              <w:spacing w:after="0" w:line="245" w:lineRule="auto"/>
+            </w:pPr>
+            <w:r>
+              <w:rPr>
+                <w:b w:val="0"/>
+                <w:color w:val="000000"/>
+                <w:sz w:val="20"/>
+              </w:rPr>
+              <w:t>Latest RTX 3060 repaired K-L  9,000 trials per condition</w:t>
+            </w:r>
+          </w:p>
+        </w:tc>
+        <w:tc>
+          <w:tcPr>
+            <w:tcW w:type="dxa" w:w="1728"/>
+            <w:vAlign w:val="center"/>
+            <w:tcBorders>
+              <w:top w:val="single" w:sz="5" w:color="D9D9D9"/>
+              <w:left w:val="single" w:sz="5" w:color="D9D9D9"/>
+              <w:bottom w:val="single" w:sz="5" w:color="D9D9D9"/>
+              <w:right w:val="single" w:sz="5" w:color="D9D9D9"/>
+            </w:tcBorders>
+            <w:shd w:fill="F3F5F6"/>
+            <w:tcMar>
+              <w:top w:w="70" w:type="dxa"/>
+              <w:bottom w:w="70" w:type="dxa"/>
+              <w:left w:w="90" w:type="dxa"/>
+              <w:right w:w="90" w:type="dxa"/>
+            </w:tcMar>
+          </w:tcPr>
+          <w:p>
+            <w:pPr>
+              <w:spacing w:after="0" w:line="245" w:lineRule="auto"/>
+              <w:jc w:val="center"/>
+            </w:pPr>
+            <w:r>
+              <w:rPr>
+                <w:b w:val="0"/>
+                <w:color w:val="000000"/>
+                <w:sz w:val="20"/>
+              </w:rPr>
+              <w:t>93.8932 s</w:t>
+            </w:r>
+          </w:p>
+        </w:tc>
+        <w:tc>
+          <w:tcPr>
+            <w:tcW w:type="dxa" w:w="1728"/>
+            <w:vAlign w:val="center"/>
+            <w:tcBorders>
+              <w:top w:val="single" w:sz="5" w:color="D9D9D9"/>
+              <w:left w:val="single" w:sz="5" w:color="D9D9D9"/>
+              <w:bottom w:val="single" w:sz="5" w:color="D9D9D9"/>
+              <w:right w:val="single" w:sz="5" w:color="D9D9D9"/>
+            </w:tcBorders>
+            <w:shd w:fill="F3F5F6"/>
+            <w:tcMar>
+              <w:top w:w="70" w:type="dxa"/>
+              <w:bottom w:w="70" w:type="dxa"/>
+              <w:left w:w="90" w:type="dxa"/>
+              <w:right w:w="90" w:type="dxa"/>
+            </w:tcMar>
+          </w:tcPr>
+          <w:p>
+            <w:pPr>
+              <w:spacing w:after="0" w:line="245" w:lineRule="auto"/>
+              <w:jc w:val="center"/>
+            </w:pPr>
+            <w:r>
+              <w:rPr>
+                <w:b w:val="0"/>
+                <w:color w:val="000000"/>
+                <w:sz w:val="20"/>
+              </w:rPr>
+              <w:t>9.2712 s</w:t>
+            </w:r>
+          </w:p>
+        </w:tc>
+        <w:tc>
+          <w:tcPr>
+            <w:tcW w:type="dxa" w:w="1944"/>
+            <w:vAlign w:val="center"/>
+            <w:tcBorders>
+              <w:top w:val="single" w:sz="5" w:color="D9D9D9"/>
+              <w:left w:val="single" w:sz="5" w:color="D9D9D9"/>
+              <w:bottom w:val="single" w:sz="5" w:color="D9D9D9"/>
+              <w:right w:val="single" w:sz="5" w:color="D9D9D9"/>
+            </w:tcBorders>
+            <w:shd w:fill="F3F5F6"/>
+            <w:tcMar>
+              <w:top w:w="70" w:type="dxa"/>
+              <w:bottom w:w="70" w:type="dxa"/>
+              <w:left w:w="90" w:type="dxa"/>
+              <w:right w:w="90" w:type="dxa"/>
+            </w:tcMar>
+          </w:tcPr>
+          <w:p>
+            <w:pPr>
+              <w:spacing w:after="0" w:line="245" w:lineRule="auto"/>
+              <w:jc w:val="center"/>
+            </w:pPr>
+            <w:r>
+              <w:rPr>
+                <w:b w:val="0"/>
+                <w:color w:val="000000"/>
+                <w:sz w:val="20"/>
+              </w:rPr>
+              <w:t>10.13x pilot</w:t>
+            </w:r>
+          </w:p>
+        </w:tc>
+      </w:tr>
     </w:tbl>
     <w:p>
       <w:pPr>
@@ -1915,6 +2051,109 @@
           </w:p>
         </w:tc>
       </w:tr>
+      <w:tr>
+        <w:trPr>
+          <w:cantSplit/>
+        </w:trPr>
+        <w:tc>
+          <w:tcPr>
+            <w:tcW w:type="dxa" w:w="2376"/>
+            <w:vAlign w:val="center"/>
+            <w:tcBorders>
+              <w:top w:val="single" w:sz="5" w:color="D9D9D9"/>
+              <w:left w:val="single" w:sz="5" w:color="D9D9D9"/>
+              <w:bottom w:val="single" w:sz="5" w:color="D9D9D9"/>
+              <w:right w:val="single" w:sz="5" w:color="D9D9D9"/>
+            </w:tcBorders>
+            <w:shd w:fill="FFFFFF"/>
+            <w:tcMar>
+              <w:top w:w="70" w:type="dxa"/>
+              <w:bottom w:w="70" w:type="dxa"/>
+              <w:left w:w="90" w:type="dxa"/>
+              <w:right w:w="90" w:type="dxa"/>
+            </w:tcMar>
+          </w:tcPr>
+          <w:p>
+            <w:pPr>
+              <w:spacing w:after="0" w:line="245" w:lineRule="auto"/>
+            </w:pPr>
+            <w:r>
+              <w:rPr>
+                <w:b w:val="0"/>
+                <w:color w:val="000000"/>
+                <w:sz w:val="20"/>
+              </w:rPr>
+              <w:t>Latest repaired laptop control</w:t>
+            </w:r>
+          </w:p>
+        </w:tc>
+        <w:tc>
+          <w:tcPr>
+            <w:tcW w:type="dxa" w:w="3744"/>
+            <w:vAlign w:val="center"/>
+            <w:tcBorders>
+              <w:top w:val="single" w:sz="5" w:color="D9D9D9"/>
+              <w:left w:val="single" w:sz="5" w:color="D9D9D9"/>
+              <w:bottom w:val="single" w:sz="5" w:color="D9D9D9"/>
+              <w:right w:val="single" w:sz="5" w:color="D9D9D9"/>
+            </w:tcBorders>
+            <w:shd w:fill="FFFFFF"/>
+            <w:tcMar>
+              <w:top w:w="70" w:type="dxa"/>
+              <w:bottom w:w="70" w:type="dxa"/>
+              <w:left w:w="90" w:type="dxa"/>
+              <w:right w:w="90" w:type="dxa"/>
+            </w:tcMar>
+          </w:tcPr>
+          <w:p>
+            <w:pPr>
+              <w:spacing w:after="0" w:line="245" w:lineRule="auto"/>
+              <w:jc w:val="center"/>
+            </w:pPr>
+            <w:r>
+              <w:rPr>
+                <w:b w:val="0"/>
+                <w:color w:val="000000"/>
+                <w:sz w:val="20"/>
+              </w:rPr>
+              <w:t>1 seed x 2 conditions x 9,000 = 18,000 trial pairs</w:t>
+            </w:r>
+          </w:p>
+        </w:tc>
+        <w:tc>
+          <w:tcPr>
+            <w:tcW w:type="dxa" w:w="3960"/>
+            <w:vAlign w:val="center"/>
+            <w:tcBorders>
+              <w:top w:val="single" w:sz="5" w:color="D9D9D9"/>
+              <w:left w:val="single" w:sz="5" w:color="D9D9D9"/>
+              <w:bottom w:val="single" w:sz="5" w:color="D9D9D9"/>
+              <w:right w:val="single" w:sz="5" w:color="D9D9D9"/>
+            </w:tcBorders>
+            <w:shd w:fill="FFFFFF"/>
+            <w:tcMar>
+              <w:top w:w="70" w:type="dxa"/>
+              <w:bottom w:w="70" w:type="dxa"/>
+              <w:left w:w="90" w:type="dxa"/>
+              <w:right w:w="90" w:type="dxa"/>
+            </w:tcMar>
+          </w:tcPr>
+          <w:p>
+            <w:pPr>
+              <w:spacing w:after="0" w:line="245" w:lineRule="auto"/>
+              <w:jc w:val="center"/>
+            </w:pPr>
+            <w:r>
+              <w:rPr>
+                <w:b w:val="0"/>
+                <w:color w:val="000000"/>
+                <w:sz w:val="20"/>
+              </w:rPr>
+              <w:t>Every paired choice and reaction time matched; ten GPU regression tests passed</w:t>
+            </w:r>
+          </w:p>
+        </w:tc>
+      </w:tr>
     </w:tbl>
     <w:p>
       <w:pPr>
@@ -1926,7 +2165,7 @@
         <w:rPr>
           <w:b w:val="0"/>
         </w:rPr>
-        <w:t>The H100 comparison with the independent original path passed the provisional per-category choice and RT screens at one parameter setting. The choice margin was one percentage point and the relative RT-quantile margin was 2%. These are screening margins, not a universal equivalence theorem. Some laptop category RT checks had too few samples for the statistical screen; exact paired matches were still verified. The repeat-call timing interval describes timing variability at that configuration, not uncertainty over every possible parameter setting. [2, 3]</w:t>
+        <w:t>The H100 comparison with the independent original path passed the provisional per-category choice and RT screens at one parameter setting. The choice margin was one percentage point and the relative RT-quantile margin was 2%. These are screening margins, not a universal equivalence theorem. Some laptop category RT checks had too few samples for the statistical screen; exact paired matches were still verified. The repeat-call timing interval describes timing variability at that configuration, not uncertainty over every possible parameter setting. The latest repaired pilot timed one call per variant after two warm-ups, so its 10.13x ratio has no repeated-timing interval. [2, 3, 10]</w:t>
       </w:r>
     </w:p>
     <w:p>
@@ -1951,7 +2190,7 @@
         <w:pageBreakBefore/>
       </w:pPr>
       <w:r>
-        <w:t>Fitting quality is still unresolved</w:t>
+        <w:t>Earlier fitting failures before the repair</w:t>
       </w:r>
     </w:p>
     <w:p>
@@ -2881,7 +3120,7 @@
         <w:rPr>
           <w:b w:val="0"/>
         </w:rPr>
-        <w:t>All eight fits failed both requirements: at most 5% mean active-parameter error and an independent median G2 no larger than the true-parameter median plus 10% of its absolute magnitude, with a minimum baseline magnitude of one, plus one unit. Scoring used keys 999, 5001 and 5002 on the same observations with new simulator randomness. It did not guide fitting and was not held-out participant validation.</w:t>
+        <w:t>All eight earlier fits failed the joint target: at most 5% mean active-parameter error and an independent median G2 no larger than the true-parameter median plus 10% of its absolute magnitude, with a minimum baseline magnitude of one, plus one unit. Scoring used keys 999, 5001 and 5002 on the same observations with new simulator randomness. It did not guide fitting and was not held-out participant validation.</w:t>
       </w:r>
     </w:p>
     <w:p>
@@ -2906,7 +3145,7 @@
         <w:rPr>
           <w:b w:val="0"/>
         </w:rPr>
-        <w:t>A CPU replay reproduced all 3,125 archived optimizer proposals exactly. All five converged fits ended with zero loss spread across the final simplex, while parameter errors remained above 5%. The other three fits reached their time caps. A small, flat simplex satisfied the stopping rule; it did not establish accurate recovery. Final clamping and the recovery-error calculation checked out. [9]</w:t>
+        <w:t>CPU replay reproduced all 3,125 archived proposals exactly. The five converged fits ended with zero loss spread across their final simplices despite errors above 5%; three other fits were capped. Optimizer convergence did not establish recovery. Final clamping and error calculations checked out. [9]</w:t>
       </w:r>
     </w:p>
     <w:p>
@@ -2922,7 +3161,7 @@
         <w:pStyle w:val="Heading1"/>
       </w:pPr>
       <w:r>
-        <w:t>K-L coefficient assignment</w:t>
+        <w:t>K L coefficient assignment</w:t>
       </w:r>
     </w:p>
     <w:p>
@@ -2941,7 +3180,7 @@
       <w:r>
         <w:drawing>
           <wp:inline xmlns:a="http://schemas.openxmlformats.org/drawingml/2006/main" xmlns:pic="http://schemas.openxmlformats.org/drawingml/2006/picture">
-            <wp:extent cx="5715000" cy="2711496"/>
+            <wp:extent cx="5212080" cy="2472885"/>
             <wp:docPr id="3" name="Picture 3"/>
             <wp:cNvGraphicFramePr>
               <a:graphicFrameLocks noChangeAspect="1"/>
@@ -2962,7 +3201,7 @@
                   <pic:spPr>
                     <a:xfrm>
                       <a:off x="0" y="0"/>
-                      <a:ext cx="5715000" cy="2711496"/>
+                      <a:ext cx="5212080" cy="2472885"/>
                     </a:xfrm>
                     <a:prstGeom prst="rect"/>
                   </pic:spPr>
@@ -2979,7 +3218,16 @@
           <w:b w:val="0"/>
           <w:sz w:val="20"/>
         </w:rPr>
-        <w:t>Aligning coefficients by physical mode removed the demonstrated jump and preserved covariance. This isolates a problem with comparisons between parameter values, not an invalid Gaussian distribution at a fixed value. The alignment is a diagnostic intervention, not a deployed or validated fitting repair.</w:t>
+        <w:t>The figure records the earlier CPU intervention. The subsequent production repair keys each random coefficient by a physical conjugate-family/component ID, with an orientation bit for the sine sign. Columns may reorder without exchanging coefficients. Independent components remain independent when both conjugates are retained. Basis values and truncation are unchanged. [10, 11]</w:t>
+      </w:r>
+    </w:p>
+    <w:p>
+      <w:r>
+        <w:rPr>
+          <w:b w:val="0"/>
+          <w:sz w:val="20"/>
+        </w:rPr>
+        <w:t>A first GPU preflight exposed a conjugate-cutoff case before any fitting; it was fixed and its failed attempt preserved. The final repair passed ten GPU regressions. At width 10 versus 10.000001, the same 1,325 components remained and the sampled field changed only 0.000802%. The repaired option was enabled in both new fitting arms; historical defaults remain available. This fixes coefficient coupling across parameter values, not hard choice boundaries or all sources of objective roughness.</w:t>
       </w:r>
     </w:p>
     <w:p>
@@ -2995,7 +3243,1933 @@
         <w:rPr>
           <w:b w:val="0"/>
         </w:rPr>
-        <w:t>Conditional resampling of one saved true-parameter pool gave median G2 scores of 624 at 512 trials and 85 at 9,000, across 128 replicates per budget. This demonstrates extra score noise, not new fitting successes. Stable mode-indexed randomness, larger final fitting budgets and restarted searches warrant controlled tests. No 3060-specific fault was isolated, and no new GPU run was performed. [9]</w:t>
+        <w:t>Resampling one saved truth pool gave median G2 624 at 512 trials and 85 at 9,000, across 128 replicates per budget. This probes score noise, not fitting success. The new study changes both noise assignment and trial budget, so their effects remain confounded. No 3060-specific fault was isolated. [9, 10]</w:t>
+      </w:r>
+    </w:p>
+    <w:p>
+      <w:pPr>
+        <w:pStyle w:val="Heading1"/>
+        <w:pageBreakBefore/>
+      </w:pPr>
+      <w:r>
+        <w:t>Repaired K L validation on the laptop</w:t>
+      </w:r>
+    </w:p>
+    <w:p>
+      <w:r>
+        <w:rPr>
+          <w:b w:val="0"/>
+        </w:rPr>
+        <w:t>The October 15 follow-up compared original full-horizon K-L with improvement 1 on the RTX 3060 Laptop GPU with 6 GB memory. Both used the repaired mode-indexed noise, the same archived observations at 9,000 trials per condition and the same seed-1 start. Its initial mean active-parameter error was 8.688%. Every optimization evaluation used 9,000 trials per condition. This is one paired baseline case across two conditions, not a repeat of all eight earlier fits. [10, 12]</w:t>
+      </w:r>
+    </w:p>
+    <w:tbl>
+      <w:tblPr>
+        <w:tblW w:type="auto" w:w="0"/>
+        <w:tblLayout w:type="fixed"/>
+        <w:tblLook w:firstColumn="1" w:firstRow="1" w:lastColumn="0" w:lastRow="0" w:noHBand="0" w:noVBand="1" w:val="04A0"/>
+      </w:tblPr>
+      <w:tblGrid>
+        <w:gridCol w:w="1656"/>
+        <w:gridCol w:w="1440"/>
+        <w:gridCol w:w="1440"/>
+        <w:gridCol w:w="1440"/>
+        <w:gridCol w:w="4104"/>
+      </w:tblGrid>
+      <w:tr>
+        <w:trPr>
+          <w:cantSplit/>
+          <w:tblHeader/>
+        </w:trPr>
+        <w:tc>
+          <w:tcPr>
+            <w:tcW w:type="dxa" w:w="1656"/>
+            <w:vAlign w:val="center"/>
+            <w:tcBorders>
+              <w:top w:val="single" w:sz="5" w:color="D9D9D9"/>
+              <w:left w:val="single" w:sz="5" w:color="D9D9D9"/>
+              <w:bottom w:val="single" w:sz="5" w:color="D9D9D9"/>
+              <w:right w:val="single" w:sz="5" w:color="D9D9D9"/>
+            </w:tcBorders>
+            <w:shd w:fill="36434B"/>
+            <w:tcMar>
+              <w:top w:w="70" w:type="dxa"/>
+              <w:bottom w:w="70" w:type="dxa"/>
+              <w:left w:w="90" w:type="dxa"/>
+              <w:right w:w="90" w:type="dxa"/>
+            </w:tcMar>
+          </w:tcPr>
+          <w:p>
+            <w:pPr>
+              <w:spacing w:after="0" w:line="245" w:lineRule="auto"/>
+            </w:pPr>
+            <w:r>
+              <w:rPr>
+                <w:b/>
+                <w:color w:val="FFFFFF"/>
+                <w:sz w:val="20"/>
+              </w:rPr>
+              <w:t>Version</w:t>
+            </w:r>
+          </w:p>
+        </w:tc>
+        <w:tc>
+          <w:tcPr>
+            <w:tcW w:type="dxa" w:w="1440"/>
+            <w:vAlign w:val="center"/>
+            <w:tcBorders>
+              <w:top w:val="single" w:sz="5" w:color="D9D9D9"/>
+              <w:left w:val="single" w:sz="5" w:color="D9D9D9"/>
+              <w:bottom w:val="single" w:sz="5" w:color="D9D9D9"/>
+              <w:right w:val="single" w:sz="5" w:color="D9D9D9"/>
+            </w:tcBorders>
+            <w:shd w:fill="36434B"/>
+            <w:tcMar>
+              <w:top w:w="70" w:type="dxa"/>
+              <w:bottom w:w="70" w:type="dxa"/>
+              <w:left w:w="90" w:type="dxa"/>
+              <w:right w:w="90" w:type="dxa"/>
+            </w:tcMar>
+          </w:tcPr>
+          <w:p>
+            <w:pPr>
+              <w:spacing w:after="0" w:line="245" w:lineRule="auto"/>
+              <w:jc w:val="center"/>
+            </w:pPr>
+            <w:r>
+              <w:rPr>
+                <w:b/>
+                <w:color w:val="FFFFFF"/>
+                <w:sz w:val="20"/>
+              </w:rPr>
+              <w:t>Training min</w:t>
+            </w:r>
+          </w:p>
+        </w:tc>
+        <w:tc>
+          <w:tcPr>
+            <w:tcW w:type="dxa" w:w="1440"/>
+            <w:vAlign w:val="center"/>
+            <w:tcBorders>
+              <w:top w:val="single" w:sz="5" w:color="D9D9D9"/>
+              <w:left w:val="single" w:sz="5" w:color="D9D9D9"/>
+              <w:bottom w:val="single" w:sz="5" w:color="D9D9D9"/>
+              <w:right w:val="single" w:sz="5" w:color="D9D9D9"/>
+            </w:tcBorders>
+            <w:shd w:fill="36434B"/>
+            <w:tcMar>
+              <w:top w:w="70" w:type="dxa"/>
+              <w:bottom w:w="70" w:type="dxa"/>
+              <w:left w:w="90" w:type="dxa"/>
+              <w:right w:w="90" w:type="dxa"/>
+            </w:tcMar>
+          </w:tcPr>
+          <w:p>
+            <w:pPr>
+              <w:spacing w:after="0" w:line="245" w:lineRule="auto"/>
+              <w:jc w:val="center"/>
+            </w:pPr>
+            <w:r>
+              <w:rPr>
+                <w:b/>
+                <w:color w:val="FFFFFF"/>
+                <w:sz w:val="20"/>
+              </w:rPr>
+              <w:t>Mean error</w:t>
+            </w:r>
+          </w:p>
+        </w:tc>
+        <w:tc>
+          <w:tcPr>
+            <w:tcW w:type="dxa" w:w="1440"/>
+            <w:vAlign w:val="center"/>
+            <w:tcBorders>
+              <w:top w:val="single" w:sz="5" w:color="D9D9D9"/>
+              <w:left w:val="single" w:sz="5" w:color="D9D9D9"/>
+              <w:bottom w:val="single" w:sz="5" w:color="D9D9D9"/>
+              <w:right w:val="single" w:sz="5" w:color="D9D9D9"/>
+            </w:tcBorders>
+            <w:shd w:fill="36434B"/>
+            <w:tcMar>
+              <w:top w:w="70" w:type="dxa"/>
+              <w:bottom w:w="70" w:type="dxa"/>
+              <w:left w:w="90" w:type="dxa"/>
+              <w:right w:w="90" w:type="dxa"/>
+            </w:tcMar>
+          </w:tcPr>
+          <w:p>
+            <w:pPr>
+              <w:spacing w:after="0" w:line="245" w:lineRule="auto"/>
+              <w:jc w:val="center"/>
+            </w:pPr>
+            <w:r>
+              <w:rPr>
+                <w:b/>
+                <w:color w:val="FFFFFF"/>
+                <w:sz w:val="20"/>
+              </w:rPr>
+              <w:t>Evaluations</w:t>
+            </w:r>
+          </w:p>
+        </w:tc>
+        <w:tc>
+          <w:tcPr>
+            <w:tcW w:type="dxa" w:w="4104"/>
+            <w:vAlign w:val="center"/>
+            <w:tcBorders>
+              <w:top w:val="single" w:sz="5" w:color="D9D9D9"/>
+              <w:left w:val="single" w:sz="5" w:color="D9D9D9"/>
+              <w:bottom w:val="single" w:sz="5" w:color="D9D9D9"/>
+              <w:right w:val="single" w:sz="5" w:color="D9D9D9"/>
+            </w:tcBorders>
+            <w:shd w:fill="36434B"/>
+            <w:tcMar>
+              <w:top w:w="70" w:type="dxa"/>
+              <w:bottom w:w="70" w:type="dxa"/>
+              <w:left w:w="90" w:type="dxa"/>
+              <w:right w:w="90" w:type="dxa"/>
+            </w:tcMar>
+          </w:tcPr>
+          <w:p>
+            <w:pPr>
+              <w:spacing w:after="0" w:line="245" w:lineRule="auto"/>
+              <w:jc w:val="center"/>
+            </w:pPr>
+            <w:r>
+              <w:rPr>
+                <w:b/>
+                <w:color w:val="FFFFFF"/>
+                <w:sz w:val="20"/>
+              </w:rPr>
+              <w:t>Search outcome</w:t>
+            </w:r>
+          </w:p>
+        </w:tc>
+      </w:tr>
+      <w:tr>
+        <w:trPr>
+          <w:cantSplit/>
+        </w:trPr>
+        <w:tc>
+          <w:tcPr>
+            <w:tcW w:type="dxa" w:w="1656"/>
+            <w:vAlign w:val="center"/>
+            <w:tcBorders>
+              <w:top w:val="single" w:sz="5" w:color="D9D9D9"/>
+              <w:left w:val="single" w:sz="5" w:color="D9D9D9"/>
+              <w:bottom w:val="single" w:sz="5" w:color="D9D9D9"/>
+              <w:right w:val="single" w:sz="5" w:color="D9D9D9"/>
+            </w:tcBorders>
+            <w:shd w:fill="FFFFFF"/>
+            <w:tcMar>
+              <w:top w:w="70" w:type="dxa"/>
+              <w:bottom w:w="70" w:type="dxa"/>
+              <w:left w:w="90" w:type="dxa"/>
+              <w:right w:w="90" w:type="dxa"/>
+            </w:tcMar>
+          </w:tcPr>
+          <w:p>
+            <w:pPr>
+              <w:spacing w:after="0" w:line="245" w:lineRule="auto"/>
+            </w:pPr>
+            <w:r>
+              <w:rPr>
+                <w:b w:val="0"/>
+                <w:color w:val="000000"/>
+                <w:sz w:val="20"/>
+              </w:rPr>
+              <w:t>Improvement 1</w:t>
+            </w:r>
+          </w:p>
+        </w:tc>
+        <w:tc>
+          <w:tcPr>
+            <w:tcW w:type="dxa" w:w="1440"/>
+            <w:vAlign w:val="center"/>
+            <w:tcBorders>
+              <w:top w:val="single" w:sz="5" w:color="D9D9D9"/>
+              <w:left w:val="single" w:sz="5" w:color="D9D9D9"/>
+              <w:bottom w:val="single" w:sz="5" w:color="D9D9D9"/>
+              <w:right w:val="single" w:sz="5" w:color="D9D9D9"/>
+            </w:tcBorders>
+            <w:shd w:fill="FFFFFF"/>
+            <w:tcMar>
+              <w:top w:w="70" w:type="dxa"/>
+              <w:bottom w:w="70" w:type="dxa"/>
+              <w:left w:w="90" w:type="dxa"/>
+              <w:right w:w="90" w:type="dxa"/>
+            </w:tcMar>
+          </w:tcPr>
+          <w:p>
+            <w:pPr>
+              <w:spacing w:after="0" w:line="245" w:lineRule="auto"/>
+              <w:jc w:val="center"/>
+            </w:pPr>
+            <w:r>
+              <w:rPr>
+                <w:b w:val="0"/>
+                <w:color w:val="000000"/>
+                <w:sz w:val="20"/>
+              </w:rPr>
+              <w:t>93.68</w:t>
+            </w:r>
+          </w:p>
+        </w:tc>
+        <w:tc>
+          <w:tcPr>
+            <w:tcW w:type="dxa" w:w="1440"/>
+            <w:vAlign w:val="center"/>
+            <w:tcBorders>
+              <w:top w:val="single" w:sz="5" w:color="D9D9D9"/>
+              <w:left w:val="single" w:sz="5" w:color="D9D9D9"/>
+              <w:bottom w:val="single" w:sz="5" w:color="D9D9D9"/>
+              <w:right w:val="single" w:sz="5" w:color="D9D9D9"/>
+            </w:tcBorders>
+            <w:shd w:fill="FFFFFF"/>
+            <w:tcMar>
+              <w:top w:w="70" w:type="dxa"/>
+              <w:bottom w:w="70" w:type="dxa"/>
+              <w:left w:w="90" w:type="dxa"/>
+              <w:right w:w="90" w:type="dxa"/>
+            </w:tcMar>
+          </w:tcPr>
+          <w:p>
+            <w:pPr>
+              <w:spacing w:after="0" w:line="245" w:lineRule="auto"/>
+              <w:jc w:val="center"/>
+            </w:pPr>
+            <w:r>
+              <w:rPr>
+                <w:b w:val="0"/>
+                <w:color w:val="000000"/>
+                <w:sz w:val="20"/>
+              </w:rPr>
+              <w:t>4.586%</w:t>
+            </w:r>
+          </w:p>
+        </w:tc>
+        <w:tc>
+          <w:tcPr>
+            <w:tcW w:type="dxa" w:w="1440"/>
+            <w:vAlign w:val="center"/>
+            <w:tcBorders>
+              <w:top w:val="single" w:sz="5" w:color="D9D9D9"/>
+              <w:left w:val="single" w:sz="5" w:color="D9D9D9"/>
+              <w:bottom w:val="single" w:sz="5" w:color="D9D9D9"/>
+              <w:right w:val="single" w:sz="5" w:color="D9D9D9"/>
+            </w:tcBorders>
+            <w:shd w:fill="FFFFFF"/>
+            <w:tcMar>
+              <w:top w:w="70" w:type="dxa"/>
+              <w:bottom w:w="70" w:type="dxa"/>
+              <w:left w:w="90" w:type="dxa"/>
+              <w:right w:w="90" w:type="dxa"/>
+            </w:tcMar>
+          </w:tcPr>
+          <w:p>
+            <w:pPr>
+              <w:spacing w:after="0" w:line="245" w:lineRule="auto"/>
+              <w:jc w:val="center"/>
+            </w:pPr>
+            <w:r>
+              <w:rPr>
+                <w:b w:val="0"/>
+                <w:color w:val="000000"/>
+                <w:sz w:val="20"/>
+              </w:rPr>
+              <w:t>563</w:t>
+            </w:r>
+          </w:p>
+        </w:tc>
+        <w:tc>
+          <w:tcPr>
+            <w:tcW w:type="dxa" w:w="4104"/>
+            <w:vAlign w:val="center"/>
+            <w:tcBorders>
+              <w:top w:val="single" w:sz="5" w:color="D9D9D9"/>
+              <w:left w:val="single" w:sz="5" w:color="D9D9D9"/>
+              <w:bottom w:val="single" w:sz="5" w:color="D9D9D9"/>
+              <w:right w:val="single" w:sz="5" w:color="D9D9D9"/>
+            </w:tcBorders>
+            <w:shd w:fill="FFFFFF"/>
+            <w:tcMar>
+              <w:top w:w="70" w:type="dxa"/>
+              <w:bottom w:w="70" w:type="dxa"/>
+              <w:left w:w="90" w:type="dxa"/>
+              <w:right w:w="90" w:type="dxa"/>
+            </w:tcMar>
+          </w:tcPr>
+          <w:p>
+            <w:pPr>
+              <w:spacing w:after="0" w:line="245" w:lineRule="auto"/>
+              <w:jc w:val="center"/>
+            </w:pPr>
+            <w:r>
+              <w:rPr>
+                <w:b w:val="0"/>
+                <w:color w:val="000000"/>
+                <w:sz w:val="20"/>
+              </w:rPr>
+              <w:t>Converged after 253 iterations</w:t>
+            </w:r>
+          </w:p>
+        </w:tc>
+      </w:tr>
+      <w:tr>
+        <w:trPr>
+          <w:cantSplit/>
+        </w:trPr>
+        <w:tc>
+          <w:tcPr>
+            <w:tcW w:type="dxa" w:w="1656"/>
+            <w:vAlign w:val="center"/>
+            <w:tcBorders>
+              <w:top w:val="single" w:sz="5" w:color="D9D9D9"/>
+              <w:left w:val="single" w:sz="5" w:color="D9D9D9"/>
+              <w:bottom w:val="single" w:sz="5" w:color="D9D9D9"/>
+              <w:right w:val="single" w:sz="5" w:color="D9D9D9"/>
+            </w:tcBorders>
+            <w:shd w:fill="F3F5F6"/>
+            <w:tcMar>
+              <w:top w:w="70" w:type="dxa"/>
+              <w:bottom w:w="70" w:type="dxa"/>
+              <w:left w:w="90" w:type="dxa"/>
+              <w:right w:w="90" w:type="dxa"/>
+            </w:tcMar>
+          </w:tcPr>
+          <w:p>
+            <w:pPr>
+              <w:spacing w:after="0" w:line="245" w:lineRule="auto"/>
+            </w:pPr>
+            <w:r>
+              <w:rPr>
+                <w:b w:val="0"/>
+                <w:color w:val="000000"/>
+                <w:sz w:val="20"/>
+              </w:rPr>
+              <w:t>Original</w:t>
+            </w:r>
+          </w:p>
+        </w:tc>
+        <w:tc>
+          <w:tcPr>
+            <w:tcW w:type="dxa" w:w="1440"/>
+            <w:vAlign w:val="center"/>
+            <w:tcBorders>
+              <w:top w:val="single" w:sz="5" w:color="D9D9D9"/>
+              <w:left w:val="single" w:sz="5" w:color="D9D9D9"/>
+              <w:bottom w:val="single" w:sz="5" w:color="D9D9D9"/>
+              <w:right w:val="single" w:sz="5" w:color="D9D9D9"/>
+            </w:tcBorders>
+            <w:shd w:fill="F3F5F6"/>
+            <w:tcMar>
+              <w:top w:w="70" w:type="dxa"/>
+              <w:bottom w:w="70" w:type="dxa"/>
+              <w:left w:w="90" w:type="dxa"/>
+              <w:right w:w="90" w:type="dxa"/>
+            </w:tcMar>
+          </w:tcPr>
+          <w:p>
+            <w:pPr>
+              <w:spacing w:after="0" w:line="245" w:lineRule="auto"/>
+              <w:jc w:val="center"/>
+            </w:pPr>
+            <w:r>
+              <w:rPr>
+                <w:b w:val="0"/>
+                <w:color w:val="000000"/>
+                <w:sz w:val="20"/>
+              </w:rPr>
+              <w:t>135.33</w:t>
+            </w:r>
+          </w:p>
+        </w:tc>
+        <w:tc>
+          <w:tcPr>
+            <w:tcW w:type="dxa" w:w="1440"/>
+            <w:vAlign w:val="center"/>
+            <w:tcBorders>
+              <w:top w:val="single" w:sz="5" w:color="D9D9D9"/>
+              <w:left w:val="single" w:sz="5" w:color="D9D9D9"/>
+              <w:bottom w:val="single" w:sz="5" w:color="D9D9D9"/>
+              <w:right w:val="single" w:sz="5" w:color="D9D9D9"/>
+            </w:tcBorders>
+            <w:shd w:fill="F3F5F6"/>
+            <w:tcMar>
+              <w:top w:w="70" w:type="dxa"/>
+              <w:bottom w:w="70" w:type="dxa"/>
+              <w:left w:w="90" w:type="dxa"/>
+              <w:right w:w="90" w:type="dxa"/>
+            </w:tcMar>
+          </w:tcPr>
+          <w:p>
+            <w:pPr>
+              <w:spacing w:after="0" w:line="245" w:lineRule="auto"/>
+              <w:jc w:val="center"/>
+            </w:pPr>
+            <w:r>
+              <w:rPr>
+                <w:b w:val="0"/>
+                <w:color w:val="000000"/>
+                <w:sz w:val="20"/>
+              </w:rPr>
+              <w:t>7.960%</w:t>
+            </w:r>
+          </w:p>
+        </w:tc>
+        <w:tc>
+          <w:tcPr>
+            <w:tcW w:type="dxa" w:w="1440"/>
+            <w:vAlign w:val="center"/>
+            <w:tcBorders>
+              <w:top w:val="single" w:sz="5" w:color="D9D9D9"/>
+              <w:left w:val="single" w:sz="5" w:color="D9D9D9"/>
+              <w:bottom w:val="single" w:sz="5" w:color="D9D9D9"/>
+              <w:right w:val="single" w:sz="5" w:color="D9D9D9"/>
+            </w:tcBorders>
+            <w:shd w:fill="F3F5F6"/>
+            <w:tcMar>
+              <w:top w:w="70" w:type="dxa"/>
+              <w:bottom w:w="70" w:type="dxa"/>
+              <w:left w:w="90" w:type="dxa"/>
+              <w:right w:w="90" w:type="dxa"/>
+            </w:tcMar>
+          </w:tcPr>
+          <w:p>
+            <w:pPr>
+              <w:spacing w:after="0" w:line="245" w:lineRule="auto"/>
+              <w:jc w:val="center"/>
+            </w:pPr>
+            <w:r>
+              <w:rPr>
+                <w:b w:val="0"/>
+                <w:color w:val="000000"/>
+                <w:sz w:val="20"/>
+              </w:rPr>
+              <w:t>86</w:t>
+            </w:r>
+          </w:p>
+        </w:tc>
+        <w:tc>
+          <w:tcPr>
+            <w:tcW w:type="dxa" w:w="4104"/>
+            <w:vAlign w:val="center"/>
+            <w:tcBorders>
+              <w:top w:val="single" w:sz="5" w:color="D9D9D9"/>
+              <w:left w:val="single" w:sz="5" w:color="D9D9D9"/>
+              <w:bottom w:val="single" w:sz="5" w:color="D9D9D9"/>
+              <w:right w:val="single" w:sz="5" w:color="D9D9D9"/>
+            </w:tcBorders>
+            <w:shd w:fill="F3F5F6"/>
+            <w:tcMar>
+              <w:top w:w="70" w:type="dxa"/>
+              <w:bottom w:w="70" w:type="dxa"/>
+              <w:left w:w="90" w:type="dxa"/>
+              <w:right w:w="90" w:type="dxa"/>
+            </w:tcMar>
+          </w:tcPr>
+          <w:p>
+            <w:pPr>
+              <w:spacing w:after="0" w:line="245" w:lineRule="auto"/>
+              <w:jc w:val="center"/>
+            </w:pPr>
+            <w:r>
+              <w:rPr>
+                <w:b w:val="0"/>
+                <w:color w:val="000000"/>
+                <w:sz w:val="20"/>
+              </w:rPr>
+              <w:t>Time cap; not converged; iteration count unavailable</w:t>
+            </w:r>
+          </w:p>
+        </w:tc>
+      </w:tr>
+    </w:tbl>
+    <w:p>
+      <w:pPr>
+        <w:spacing w:after="0"/>
+      </w:pPr>
+    </w:p>
+    <w:p>
+      <w:r>
+        <w:rPr>
+          <w:b w:val="0"/>
+          <w:sz w:val="20"/>
+        </w:rPr>
+        <w:t>Both arms used the ordinary 13-coordinate simplex search, at most 1,000 iterations, tolerance 0.00001 and an 8,100-second fit cap checked after each objective call. The inactive sv coordinate remained in the search and was excluded from mean recovery error. Other improvements were off. Training used key 321, trial chunks of 8, block size 32 for improvement 1, float32 fields and float64 RTs. Training minutes exclude compilation, warm-up and independent scoring.</w:t>
+      </w:r>
+    </w:p>
+    <w:p>
+      <w:pPr>
+        <w:spacing w:after="80"/>
+        <w:jc w:val="center"/>
+      </w:pPr>
+      <w:r>
+        <w:drawing>
+          <wp:inline xmlns:a="http://schemas.openxmlformats.org/drawingml/2006/main" xmlns:pic="http://schemas.openxmlformats.org/drawingml/2006/picture">
+            <wp:extent cx="6126480" cy="3216402"/>
+            <wp:docPr id="4" name="Picture 4"/>
+            <wp:cNvGraphicFramePr>
+              <a:graphicFrameLocks noChangeAspect="1"/>
+            </wp:cNvGraphicFramePr>
+            <a:graphic>
+              <a:graphicData uri="http://schemas.openxmlformats.org/drawingml/2006/picture">
+                <pic:pic>
+                  <pic:nvPicPr>
+                    <pic:cNvPr id="0" name="recovery-progress.png"/>
+                    <pic:cNvPicPr/>
+                  </pic:nvPicPr>
+                  <pic:blipFill>
+                    <a:blip r:embed="rId13"/>
+                    <a:stretch>
+                      <a:fillRect/>
+                    </a:stretch>
+                  </pic:blipFill>
+                  <pic:spPr>
+                    <a:xfrm>
+                      <a:off x="0" y="0"/>
+                      <a:ext cx="6126480" cy="3216402"/>
+                    </a:xfrm>
+                    <a:prstGeom prst="rect"/>
+                  </pic:spPr>
+                </pic:pic>
+              </a:graphicData>
+            </a:graphic>
+          </wp:inline>
+        </w:drawing>
+      </w:r>
+    </w:p>
+    <w:p>
+      <w:r>
+        <w:rPr>
+          <w:b w:val="0"/>
+          <w:sz w:val="20"/>
+        </w:rPr>
+        <w:t>The curve follows successive best training losses, not estimates chosen using true parameters. Improvement 1 returned below 5% mean error; original did not before its cap. The two noise layouts differ, so fixed root keys alone do not give identical original-versus-early-stop samples. The ratio of these fit durations is not a speedup to equal scientific quality.</w:t>
+      </w:r>
+    </w:p>
+    <w:p>
+      <w:pPr>
+        <w:pStyle w:val="Heading1"/>
+        <w:pageBreakBefore/>
+      </w:pPr>
+      <w:r>
+        <w:t>Recovery and prediction are different checks</w:t>
+      </w:r>
+    </w:p>
+    <w:p>
+      <w:r>
+        <w:rPr>
+          <w:b w:val="0"/>
+        </w:rPr>
+        <w:t>Recovery asks whether estimated model settings are near the known synthetic truth. Prediction asks whether those settings reproduce the observed choice and RT distributions. The predeclared joint gate required mean active error at most 5% and a median independent G2 within an additive margin of the true-parameter reference. A mean error below 5% does not make every individual parameter accurate. [10, 12]</w:t>
+      </w:r>
+    </w:p>
+    <w:tbl>
+      <w:tblPr>
+        <w:tblW w:type="auto" w:w="0"/>
+        <w:tblLayout w:type="fixed"/>
+        <w:tblLook w:firstColumn="1" w:firstRow="1" w:lastColumn="0" w:lastRow="0" w:noHBand="0" w:noVBand="1" w:val="04A0"/>
+      </w:tblPr>
+      <w:tblGrid>
+        <w:gridCol w:w="3312"/>
+        <w:gridCol w:w="1656"/>
+        <w:gridCol w:w="1656"/>
+        <w:gridCol w:w="1656"/>
+        <w:gridCol w:w="1800"/>
+      </w:tblGrid>
+      <w:tr>
+        <w:trPr>
+          <w:cantSplit/>
+          <w:tblHeader/>
+        </w:trPr>
+        <w:tc>
+          <w:tcPr>
+            <w:tcW w:type="dxa" w:w="3312"/>
+            <w:vAlign w:val="center"/>
+            <w:tcBorders>
+              <w:top w:val="single" w:sz="5" w:color="D9D9D9"/>
+              <w:left w:val="single" w:sz="5" w:color="D9D9D9"/>
+              <w:bottom w:val="single" w:sz="5" w:color="D9D9D9"/>
+              <w:right w:val="single" w:sz="5" w:color="D9D9D9"/>
+            </w:tcBorders>
+            <w:shd w:fill="36434B"/>
+            <w:tcMar>
+              <w:top w:w="70" w:type="dxa"/>
+              <w:bottom w:w="70" w:type="dxa"/>
+              <w:left w:w="90" w:type="dxa"/>
+              <w:right w:w="90" w:type="dxa"/>
+            </w:tcMar>
+          </w:tcPr>
+          <w:p>
+            <w:pPr>
+              <w:spacing w:after="0" w:line="245" w:lineRule="auto"/>
+            </w:pPr>
+            <w:r>
+              <w:rPr>
+                <w:b/>
+                <w:color w:val="FFFFFF"/>
+                <w:sz w:val="20"/>
+              </w:rPr>
+              <w:t>Estimate</w:t>
+            </w:r>
+          </w:p>
+        </w:tc>
+        <w:tc>
+          <w:tcPr>
+            <w:tcW w:type="dxa" w:w="1656"/>
+            <w:vAlign w:val="center"/>
+            <w:tcBorders>
+              <w:top w:val="single" w:sz="5" w:color="D9D9D9"/>
+              <w:left w:val="single" w:sz="5" w:color="D9D9D9"/>
+              <w:bottom w:val="single" w:sz="5" w:color="D9D9D9"/>
+              <w:right w:val="single" w:sz="5" w:color="D9D9D9"/>
+            </w:tcBorders>
+            <w:shd w:fill="36434B"/>
+            <w:tcMar>
+              <w:top w:w="70" w:type="dxa"/>
+              <w:bottom w:w="70" w:type="dxa"/>
+              <w:left w:w="90" w:type="dxa"/>
+              <w:right w:w="90" w:type="dxa"/>
+            </w:tcMar>
+          </w:tcPr>
+          <w:p>
+            <w:pPr>
+              <w:spacing w:after="0" w:line="245" w:lineRule="auto"/>
+              <w:jc w:val="center"/>
+            </w:pPr>
+            <w:r>
+              <w:rPr>
+                <w:b/>
+                <w:color w:val="FFFFFF"/>
+                <w:sz w:val="20"/>
+              </w:rPr>
+              <w:t>G2 key 999</w:t>
+            </w:r>
+          </w:p>
+        </w:tc>
+        <w:tc>
+          <w:tcPr>
+            <w:tcW w:type="dxa" w:w="1656"/>
+            <w:vAlign w:val="center"/>
+            <w:tcBorders>
+              <w:top w:val="single" w:sz="5" w:color="D9D9D9"/>
+              <w:left w:val="single" w:sz="5" w:color="D9D9D9"/>
+              <w:bottom w:val="single" w:sz="5" w:color="D9D9D9"/>
+              <w:right w:val="single" w:sz="5" w:color="D9D9D9"/>
+            </w:tcBorders>
+            <w:shd w:fill="36434B"/>
+            <w:tcMar>
+              <w:top w:w="70" w:type="dxa"/>
+              <w:bottom w:w="70" w:type="dxa"/>
+              <w:left w:w="90" w:type="dxa"/>
+              <w:right w:w="90" w:type="dxa"/>
+            </w:tcMar>
+          </w:tcPr>
+          <w:p>
+            <w:pPr>
+              <w:spacing w:after="0" w:line="245" w:lineRule="auto"/>
+              <w:jc w:val="center"/>
+            </w:pPr>
+            <w:r>
+              <w:rPr>
+                <w:b/>
+                <w:color w:val="FFFFFF"/>
+                <w:sz w:val="20"/>
+              </w:rPr>
+              <w:t>G2 key 5001</w:t>
+            </w:r>
+          </w:p>
+        </w:tc>
+        <w:tc>
+          <w:tcPr>
+            <w:tcW w:type="dxa" w:w="1656"/>
+            <w:vAlign w:val="center"/>
+            <w:tcBorders>
+              <w:top w:val="single" w:sz="5" w:color="D9D9D9"/>
+              <w:left w:val="single" w:sz="5" w:color="D9D9D9"/>
+              <w:bottom w:val="single" w:sz="5" w:color="D9D9D9"/>
+              <w:right w:val="single" w:sz="5" w:color="D9D9D9"/>
+            </w:tcBorders>
+            <w:shd w:fill="36434B"/>
+            <w:tcMar>
+              <w:top w:w="70" w:type="dxa"/>
+              <w:bottom w:w="70" w:type="dxa"/>
+              <w:left w:w="90" w:type="dxa"/>
+              <w:right w:w="90" w:type="dxa"/>
+            </w:tcMar>
+          </w:tcPr>
+          <w:p>
+            <w:pPr>
+              <w:spacing w:after="0" w:line="245" w:lineRule="auto"/>
+              <w:jc w:val="center"/>
+            </w:pPr>
+            <w:r>
+              <w:rPr>
+                <w:b/>
+                <w:color w:val="FFFFFF"/>
+                <w:sz w:val="20"/>
+              </w:rPr>
+              <w:t>G2 key 5002</w:t>
+            </w:r>
+          </w:p>
+        </w:tc>
+        <w:tc>
+          <w:tcPr>
+            <w:tcW w:type="dxa" w:w="1800"/>
+            <w:vAlign w:val="center"/>
+            <w:tcBorders>
+              <w:top w:val="single" w:sz="5" w:color="D9D9D9"/>
+              <w:left w:val="single" w:sz="5" w:color="D9D9D9"/>
+              <w:bottom w:val="single" w:sz="5" w:color="D9D9D9"/>
+              <w:right w:val="single" w:sz="5" w:color="D9D9D9"/>
+            </w:tcBorders>
+            <w:shd w:fill="36434B"/>
+            <w:tcMar>
+              <w:top w:w="70" w:type="dxa"/>
+              <w:bottom w:w="70" w:type="dxa"/>
+              <w:left w:w="90" w:type="dxa"/>
+              <w:right w:w="90" w:type="dxa"/>
+            </w:tcMar>
+          </w:tcPr>
+          <w:p>
+            <w:pPr>
+              <w:spacing w:after="0" w:line="245" w:lineRule="auto"/>
+              <w:jc w:val="center"/>
+            </w:pPr>
+            <w:r>
+              <w:rPr>
+                <w:b/>
+                <w:color w:val="FFFFFF"/>
+                <w:sz w:val="20"/>
+              </w:rPr>
+              <w:t>Median G2</w:t>
+            </w:r>
+          </w:p>
+        </w:tc>
+      </w:tr>
+      <w:tr>
+        <w:trPr>
+          <w:cantSplit/>
+        </w:trPr>
+        <w:tc>
+          <w:tcPr>
+            <w:tcW w:type="dxa" w:w="3312"/>
+            <w:vAlign w:val="center"/>
+            <w:tcBorders>
+              <w:top w:val="single" w:sz="5" w:color="D9D9D9"/>
+              <w:left w:val="single" w:sz="5" w:color="D9D9D9"/>
+              <w:bottom w:val="single" w:sz="5" w:color="D9D9D9"/>
+              <w:right w:val="single" w:sz="5" w:color="D9D9D9"/>
+            </w:tcBorders>
+            <w:shd w:fill="FFFFFF"/>
+            <w:tcMar>
+              <w:top w:w="70" w:type="dxa"/>
+              <w:bottom w:w="70" w:type="dxa"/>
+              <w:left w:w="90" w:type="dxa"/>
+              <w:right w:w="90" w:type="dxa"/>
+            </w:tcMar>
+          </w:tcPr>
+          <w:p>
+            <w:pPr>
+              <w:spacing w:after="0" w:line="245" w:lineRule="auto"/>
+            </w:pPr>
+            <w:r>
+              <w:rPr>
+                <w:b w:val="0"/>
+                <w:color w:val="000000"/>
+                <w:sz w:val="20"/>
+              </w:rPr>
+              <w:t>True parameters</w:t>
+            </w:r>
+          </w:p>
+        </w:tc>
+        <w:tc>
+          <w:tcPr>
+            <w:tcW w:type="dxa" w:w="1656"/>
+            <w:vAlign w:val="center"/>
+            <w:tcBorders>
+              <w:top w:val="single" w:sz="5" w:color="D9D9D9"/>
+              <w:left w:val="single" w:sz="5" w:color="D9D9D9"/>
+              <w:bottom w:val="single" w:sz="5" w:color="D9D9D9"/>
+              <w:right w:val="single" w:sz="5" w:color="D9D9D9"/>
+            </w:tcBorders>
+            <w:shd w:fill="FFFFFF"/>
+            <w:tcMar>
+              <w:top w:w="70" w:type="dxa"/>
+              <w:bottom w:w="70" w:type="dxa"/>
+              <w:left w:w="90" w:type="dxa"/>
+              <w:right w:w="90" w:type="dxa"/>
+            </w:tcMar>
+          </w:tcPr>
+          <w:p>
+            <w:pPr>
+              <w:spacing w:after="0" w:line="245" w:lineRule="auto"/>
+              <w:jc w:val="center"/>
+            </w:pPr>
+            <w:r>
+              <w:rPr>
+                <w:b w:val="0"/>
+                <w:color w:val="000000"/>
+                <w:sz w:val="20"/>
+              </w:rPr>
+              <w:t>35.76</w:t>
+            </w:r>
+          </w:p>
+        </w:tc>
+        <w:tc>
+          <w:tcPr>
+            <w:tcW w:type="dxa" w:w="1656"/>
+            <w:vAlign w:val="center"/>
+            <w:tcBorders>
+              <w:top w:val="single" w:sz="5" w:color="D9D9D9"/>
+              <w:left w:val="single" w:sz="5" w:color="D9D9D9"/>
+              <w:bottom w:val="single" w:sz="5" w:color="D9D9D9"/>
+              <w:right w:val="single" w:sz="5" w:color="D9D9D9"/>
+            </w:tcBorders>
+            <w:shd w:fill="FFFFFF"/>
+            <w:tcMar>
+              <w:top w:w="70" w:type="dxa"/>
+              <w:bottom w:w="70" w:type="dxa"/>
+              <w:left w:w="90" w:type="dxa"/>
+              <w:right w:w="90" w:type="dxa"/>
+            </w:tcMar>
+          </w:tcPr>
+          <w:p>
+            <w:pPr>
+              <w:spacing w:after="0" w:line="245" w:lineRule="auto"/>
+              <w:jc w:val="center"/>
+            </w:pPr>
+            <w:r>
+              <w:rPr>
+                <w:b w:val="0"/>
+                <w:color w:val="000000"/>
+                <w:sz w:val="20"/>
+              </w:rPr>
+              <w:t>34.32</w:t>
+            </w:r>
+          </w:p>
+        </w:tc>
+        <w:tc>
+          <w:tcPr>
+            <w:tcW w:type="dxa" w:w="1656"/>
+            <w:vAlign w:val="center"/>
+            <w:tcBorders>
+              <w:top w:val="single" w:sz="5" w:color="D9D9D9"/>
+              <w:left w:val="single" w:sz="5" w:color="D9D9D9"/>
+              <w:bottom w:val="single" w:sz="5" w:color="D9D9D9"/>
+              <w:right w:val="single" w:sz="5" w:color="D9D9D9"/>
+            </w:tcBorders>
+            <w:shd w:fill="FFFFFF"/>
+            <w:tcMar>
+              <w:top w:w="70" w:type="dxa"/>
+              <w:bottom w:w="70" w:type="dxa"/>
+              <w:left w:w="90" w:type="dxa"/>
+              <w:right w:w="90" w:type="dxa"/>
+            </w:tcMar>
+          </w:tcPr>
+          <w:p>
+            <w:pPr>
+              <w:spacing w:after="0" w:line="245" w:lineRule="auto"/>
+              <w:jc w:val="center"/>
+            </w:pPr>
+            <w:r>
+              <w:rPr>
+                <w:b w:val="0"/>
+                <w:color w:val="000000"/>
+                <w:sz w:val="20"/>
+              </w:rPr>
+              <w:t>84.07</w:t>
+            </w:r>
+          </w:p>
+        </w:tc>
+        <w:tc>
+          <w:tcPr>
+            <w:tcW w:type="dxa" w:w="1800"/>
+            <w:vAlign w:val="center"/>
+            <w:tcBorders>
+              <w:top w:val="single" w:sz="5" w:color="D9D9D9"/>
+              <w:left w:val="single" w:sz="5" w:color="D9D9D9"/>
+              <w:bottom w:val="single" w:sz="5" w:color="D9D9D9"/>
+              <w:right w:val="single" w:sz="5" w:color="D9D9D9"/>
+            </w:tcBorders>
+            <w:shd w:fill="FFFFFF"/>
+            <w:tcMar>
+              <w:top w:w="70" w:type="dxa"/>
+              <w:bottom w:w="70" w:type="dxa"/>
+              <w:left w:w="90" w:type="dxa"/>
+              <w:right w:w="90" w:type="dxa"/>
+            </w:tcMar>
+          </w:tcPr>
+          <w:p>
+            <w:pPr>
+              <w:spacing w:after="0" w:line="245" w:lineRule="auto"/>
+              <w:jc w:val="center"/>
+            </w:pPr>
+            <w:r>
+              <w:rPr>
+                <w:b w:val="0"/>
+                <w:color w:val="000000"/>
+                <w:sz w:val="20"/>
+              </w:rPr>
+              <w:t>35.76</w:t>
+            </w:r>
+          </w:p>
+        </w:tc>
+      </w:tr>
+      <w:tr>
+        <w:trPr>
+          <w:cantSplit/>
+        </w:trPr>
+        <w:tc>
+          <w:tcPr>
+            <w:tcW w:type="dxa" w:w="3312"/>
+            <w:vAlign w:val="center"/>
+            <w:tcBorders>
+              <w:top w:val="single" w:sz="5" w:color="D9D9D9"/>
+              <w:left w:val="single" w:sz="5" w:color="D9D9D9"/>
+              <w:bottom w:val="single" w:sz="5" w:color="D9D9D9"/>
+              <w:right w:val="single" w:sz="5" w:color="D9D9D9"/>
+            </w:tcBorders>
+            <w:shd w:fill="F3F5F6"/>
+            <w:tcMar>
+              <w:top w:w="70" w:type="dxa"/>
+              <w:bottom w:w="70" w:type="dxa"/>
+              <w:left w:w="90" w:type="dxa"/>
+              <w:right w:w="90" w:type="dxa"/>
+            </w:tcMar>
+          </w:tcPr>
+          <w:p>
+            <w:pPr>
+              <w:spacing w:after="0" w:line="245" w:lineRule="auto"/>
+            </w:pPr>
+            <w:r>
+              <w:rPr>
+                <w:b w:val="0"/>
+                <w:color w:val="000000"/>
+                <w:sz w:val="20"/>
+              </w:rPr>
+              <w:t>Improvement 1 returned</w:t>
+            </w:r>
+          </w:p>
+        </w:tc>
+        <w:tc>
+          <w:tcPr>
+            <w:tcW w:type="dxa" w:w="1656"/>
+            <w:vAlign w:val="center"/>
+            <w:tcBorders>
+              <w:top w:val="single" w:sz="5" w:color="D9D9D9"/>
+              <w:left w:val="single" w:sz="5" w:color="D9D9D9"/>
+              <w:bottom w:val="single" w:sz="5" w:color="D9D9D9"/>
+              <w:right w:val="single" w:sz="5" w:color="D9D9D9"/>
+            </w:tcBorders>
+            <w:shd w:fill="F3F5F6"/>
+            <w:tcMar>
+              <w:top w:w="70" w:type="dxa"/>
+              <w:bottom w:w="70" w:type="dxa"/>
+              <w:left w:w="90" w:type="dxa"/>
+              <w:right w:w="90" w:type="dxa"/>
+            </w:tcMar>
+          </w:tcPr>
+          <w:p>
+            <w:pPr>
+              <w:spacing w:after="0" w:line="245" w:lineRule="auto"/>
+              <w:jc w:val="center"/>
+            </w:pPr>
+            <w:r>
+              <w:rPr>
+                <w:b w:val="0"/>
+                <w:color w:val="000000"/>
+                <w:sz w:val="20"/>
+              </w:rPr>
+              <w:t>82.11</w:t>
+            </w:r>
+          </w:p>
+        </w:tc>
+        <w:tc>
+          <w:tcPr>
+            <w:tcW w:type="dxa" w:w="1656"/>
+            <w:vAlign w:val="center"/>
+            <w:tcBorders>
+              <w:top w:val="single" w:sz="5" w:color="D9D9D9"/>
+              <w:left w:val="single" w:sz="5" w:color="D9D9D9"/>
+              <w:bottom w:val="single" w:sz="5" w:color="D9D9D9"/>
+              <w:right w:val="single" w:sz="5" w:color="D9D9D9"/>
+            </w:tcBorders>
+            <w:shd w:fill="F3F5F6"/>
+            <w:tcMar>
+              <w:top w:w="70" w:type="dxa"/>
+              <w:bottom w:w="70" w:type="dxa"/>
+              <w:left w:w="90" w:type="dxa"/>
+              <w:right w:w="90" w:type="dxa"/>
+            </w:tcMar>
+          </w:tcPr>
+          <w:p>
+            <w:pPr>
+              <w:spacing w:after="0" w:line="245" w:lineRule="auto"/>
+              <w:jc w:val="center"/>
+            </w:pPr>
+            <w:r>
+              <w:rPr>
+                <w:b w:val="0"/>
+                <w:color w:val="000000"/>
+                <w:sz w:val="20"/>
+              </w:rPr>
+              <w:t>50.31</w:t>
+            </w:r>
+          </w:p>
+        </w:tc>
+        <w:tc>
+          <w:tcPr>
+            <w:tcW w:type="dxa" w:w="1656"/>
+            <w:vAlign w:val="center"/>
+            <w:tcBorders>
+              <w:top w:val="single" w:sz="5" w:color="D9D9D9"/>
+              <w:left w:val="single" w:sz="5" w:color="D9D9D9"/>
+              <w:bottom w:val="single" w:sz="5" w:color="D9D9D9"/>
+              <w:right w:val="single" w:sz="5" w:color="D9D9D9"/>
+            </w:tcBorders>
+            <w:shd w:fill="F3F5F6"/>
+            <w:tcMar>
+              <w:top w:w="70" w:type="dxa"/>
+              <w:bottom w:w="70" w:type="dxa"/>
+              <w:left w:w="90" w:type="dxa"/>
+              <w:right w:w="90" w:type="dxa"/>
+            </w:tcMar>
+          </w:tcPr>
+          <w:p>
+            <w:pPr>
+              <w:spacing w:after="0" w:line="245" w:lineRule="auto"/>
+              <w:jc w:val="center"/>
+            </w:pPr>
+            <w:r>
+              <w:rPr>
+                <w:b w:val="0"/>
+                <w:color w:val="000000"/>
+                <w:sz w:val="20"/>
+              </w:rPr>
+              <w:t>80.30</w:t>
+            </w:r>
+          </w:p>
+        </w:tc>
+        <w:tc>
+          <w:tcPr>
+            <w:tcW w:type="dxa" w:w="1800"/>
+            <w:vAlign w:val="center"/>
+            <w:tcBorders>
+              <w:top w:val="single" w:sz="5" w:color="D9D9D9"/>
+              <w:left w:val="single" w:sz="5" w:color="D9D9D9"/>
+              <w:bottom w:val="single" w:sz="5" w:color="D9D9D9"/>
+              <w:right w:val="single" w:sz="5" w:color="D9D9D9"/>
+            </w:tcBorders>
+            <w:shd w:fill="F3F5F6"/>
+            <w:tcMar>
+              <w:top w:w="70" w:type="dxa"/>
+              <w:bottom w:w="70" w:type="dxa"/>
+              <w:left w:w="90" w:type="dxa"/>
+              <w:right w:w="90" w:type="dxa"/>
+            </w:tcMar>
+          </w:tcPr>
+          <w:p>
+            <w:pPr>
+              <w:spacing w:after="0" w:line="245" w:lineRule="auto"/>
+              <w:jc w:val="center"/>
+            </w:pPr>
+            <w:r>
+              <w:rPr>
+                <w:b w:val="0"/>
+                <w:color w:val="000000"/>
+                <w:sz w:val="20"/>
+              </w:rPr>
+              <w:t>80.30</w:t>
+            </w:r>
+          </w:p>
+        </w:tc>
+      </w:tr>
+      <w:tr>
+        <w:trPr>
+          <w:cantSplit/>
+        </w:trPr>
+        <w:tc>
+          <w:tcPr>
+            <w:tcW w:type="dxa" w:w="3312"/>
+            <w:vAlign w:val="center"/>
+            <w:tcBorders>
+              <w:top w:val="single" w:sz="5" w:color="D9D9D9"/>
+              <w:left w:val="single" w:sz="5" w:color="D9D9D9"/>
+              <w:bottom w:val="single" w:sz="5" w:color="D9D9D9"/>
+              <w:right w:val="single" w:sz="5" w:color="D9D9D9"/>
+            </w:tcBorders>
+            <w:shd w:fill="FFFFFF"/>
+            <w:tcMar>
+              <w:top w:w="70" w:type="dxa"/>
+              <w:bottom w:w="70" w:type="dxa"/>
+              <w:left w:w="90" w:type="dxa"/>
+              <w:right w:w="90" w:type="dxa"/>
+            </w:tcMar>
+          </w:tcPr>
+          <w:p>
+            <w:pPr>
+              <w:spacing w:after="0" w:line="245" w:lineRule="auto"/>
+            </w:pPr>
+            <w:r>
+              <w:rPr>
+                <w:b w:val="0"/>
+                <w:color w:val="000000"/>
+                <w:sz w:val="20"/>
+              </w:rPr>
+              <w:t>Original returned</w:t>
+            </w:r>
+          </w:p>
+        </w:tc>
+        <w:tc>
+          <w:tcPr>
+            <w:tcW w:type="dxa" w:w="1656"/>
+            <w:vAlign w:val="center"/>
+            <w:tcBorders>
+              <w:top w:val="single" w:sz="5" w:color="D9D9D9"/>
+              <w:left w:val="single" w:sz="5" w:color="D9D9D9"/>
+              <w:bottom w:val="single" w:sz="5" w:color="D9D9D9"/>
+              <w:right w:val="single" w:sz="5" w:color="D9D9D9"/>
+            </w:tcBorders>
+            <w:shd w:fill="FFFFFF"/>
+            <w:tcMar>
+              <w:top w:w="70" w:type="dxa"/>
+              <w:bottom w:w="70" w:type="dxa"/>
+              <w:left w:w="90" w:type="dxa"/>
+              <w:right w:w="90" w:type="dxa"/>
+            </w:tcMar>
+          </w:tcPr>
+          <w:p>
+            <w:pPr>
+              <w:spacing w:after="0" w:line="245" w:lineRule="auto"/>
+              <w:jc w:val="center"/>
+            </w:pPr>
+            <w:r>
+              <w:rPr>
+                <w:b w:val="0"/>
+                <w:color w:val="000000"/>
+                <w:sz w:val="20"/>
+              </w:rPr>
+              <w:t>143.20</w:t>
+            </w:r>
+          </w:p>
+        </w:tc>
+        <w:tc>
+          <w:tcPr>
+            <w:tcW w:type="dxa" w:w="1656"/>
+            <w:vAlign w:val="center"/>
+            <w:tcBorders>
+              <w:top w:val="single" w:sz="5" w:color="D9D9D9"/>
+              <w:left w:val="single" w:sz="5" w:color="D9D9D9"/>
+              <w:bottom w:val="single" w:sz="5" w:color="D9D9D9"/>
+              <w:right w:val="single" w:sz="5" w:color="D9D9D9"/>
+            </w:tcBorders>
+            <w:shd w:fill="FFFFFF"/>
+            <w:tcMar>
+              <w:top w:w="70" w:type="dxa"/>
+              <w:bottom w:w="70" w:type="dxa"/>
+              <w:left w:w="90" w:type="dxa"/>
+              <w:right w:w="90" w:type="dxa"/>
+            </w:tcMar>
+          </w:tcPr>
+          <w:p>
+            <w:pPr>
+              <w:spacing w:after="0" w:line="245" w:lineRule="auto"/>
+              <w:jc w:val="center"/>
+            </w:pPr>
+            <w:r>
+              <w:rPr>
+                <w:b w:val="0"/>
+                <w:color w:val="000000"/>
+                <w:sz w:val="20"/>
+              </w:rPr>
+              <w:t>144.96</w:t>
+            </w:r>
+          </w:p>
+        </w:tc>
+        <w:tc>
+          <w:tcPr>
+            <w:tcW w:type="dxa" w:w="1656"/>
+            <w:vAlign w:val="center"/>
+            <w:tcBorders>
+              <w:top w:val="single" w:sz="5" w:color="D9D9D9"/>
+              <w:left w:val="single" w:sz="5" w:color="D9D9D9"/>
+              <w:bottom w:val="single" w:sz="5" w:color="D9D9D9"/>
+              <w:right w:val="single" w:sz="5" w:color="D9D9D9"/>
+            </w:tcBorders>
+            <w:shd w:fill="FFFFFF"/>
+            <w:tcMar>
+              <w:top w:w="70" w:type="dxa"/>
+              <w:bottom w:w="70" w:type="dxa"/>
+              <w:left w:w="90" w:type="dxa"/>
+              <w:right w:w="90" w:type="dxa"/>
+            </w:tcMar>
+          </w:tcPr>
+          <w:p>
+            <w:pPr>
+              <w:spacing w:after="0" w:line="245" w:lineRule="auto"/>
+              <w:jc w:val="center"/>
+            </w:pPr>
+            <w:r>
+              <w:rPr>
+                <w:b w:val="0"/>
+                <w:color w:val="000000"/>
+                <w:sz w:val="20"/>
+              </w:rPr>
+              <w:t>169.27</w:t>
+            </w:r>
+          </w:p>
+        </w:tc>
+        <w:tc>
+          <w:tcPr>
+            <w:tcW w:type="dxa" w:w="1800"/>
+            <w:vAlign w:val="center"/>
+            <w:tcBorders>
+              <w:top w:val="single" w:sz="5" w:color="D9D9D9"/>
+              <w:left w:val="single" w:sz="5" w:color="D9D9D9"/>
+              <w:bottom w:val="single" w:sz="5" w:color="D9D9D9"/>
+              <w:right w:val="single" w:sz="5" w:color="D9D9D9"/>
+            </w:tcBorders>
+            <w:shd w:fill="FFFFFF"/>
+            <w:tcMar>
+              <w:top w:w="70" w:type="dxa"/>
+              <w:bottom w:w="70" w:type="dxa"/>
+              <w:left w:w="90" w:type="dxa"/>
+              <w:right w:w="90" w:type="dxa"/>
+            </w:tcMar>
+          </w:tcPr>
+          <w:p>
+            <w:pPr>
+              <w:spacing w:after="0" w:line="245" w:lineRule="auto"/>
+              <w:jc w:val="center"/>
+            </w:pPr>
+            <w:r>
+              <w:rPr>
+                <w:b w:val="0"/>
+                <w:color w:val="000000"/>
+                <w:sz w:val="20"/>
+              </w:rPr>
+              <w:t>144.96</w:t>
+            </w:r>
+          </w:p>
+        </w:tc>
+      </w:tr>
+    </w:tbl>
+    <w:p>
+      <w:pPr>
+        <w:spacing w:after="0"/>
+      </w:pPr>
+    </w:p>
+    <w:p>
+      <w:r>
+        <w:rPr>
+          <w:b w:val="0"/>
+        </w:rPr>
+        <w:t>Lower G2 means less mismatch; G2 is not a percentage. The cutoff was the truth median plus 10% of its absolute magnitude, with a minimum magnitude of one, plus one: 40.336 here. Improvement 1 scored 80.302 and original 144.960. Both failed. An earlier scored improvement-1 checkpoint had 4.891% parameter error and median G2 74.595, also a failure.</w:t>
+      </w:r>
+    </w:p>
+    <w:p>
+      <w:pPr>
+        <w:pStyle w:val="Heading1"/>
+      </w:pPr>
+      <w:r>
+        <w:t>Why below five percent does not guarantee the gate</w:t>
+      </w:r>
+    </w:p>
+    <w:tbl>
+      <w:tblPr>
+        <w:tblW w:type="auto" w:w="0"/>
+        <w:tblLayout w:type="fixed"/>
+        <w:tblLook w:firstColumn="1" w:firstRow="1" w:lastColumn="0" w:lastRow="0" w:noHBand="0" w:noVBand="1" w:val="04A0"/>
+      </w:tblPr>
+      <w:tblGrid>
+        <w:gridCol w:w="4752"/>
+        <w:gridCol w:w="1584"/>
+        <w:gridCol w:w="1872"/>
+        <w:gridCol w:w="1872"/>
+      </w:tblGrid>
+      <w:tr>
+        <w:trPr>
+          <w:cantSplit/>
+          <w:tblHeader/>
+        </w:trPr>
+        <w:tc>
+          <w:tcPr>
+            <w:tcW w:type="dxa" w:w="4752"/>
+            <w:vAlign w:val="center"/>
+            <w:tcBorders>
+              <w:top w:val="single" w:sz="5" w:color="D9D9D9"/>
+              <w:left w:val="single" w:sz="5" w:color="D9D9D9"/>
+              <w:bottom w:val="single" w:sz="5" w:color="D9D9D9"/>
+              <w:right w:val="single" w:sz="5" w:color="D9D9D9"/>
+            </w:tcBorders>
+            <w:shd w:fill="36434B"/>
+            <w:tcMar>
+              <w:top w:w="70" w:type="dxa"/>
+              <w:bottom w:w="70" w:type="dxa"/>
+              <w:left w:w="90" w:type="dxa"/>
+              <w:right w:w="90" w:type="dxa"/>
+            </w:tcMar>
+          </w:tcPr>
+          <w:p>
+            <w:pPr>
+              <w:spacing w:after="0" w:line="245" w:lineRule="auto"/>
+            </w:pPr>
+            <w:r>
+              <w:rPr>
+                <w:b/>
+                <w:color w:val="FFFFFF"/>
+                <w:sz w:val="20"/>
+              </w:rPr>
+              <w:t>Parameter</w:t>
+            </w:r>
+          </w:p>
+        </w:tc>
+        <w:tc>
+          <w:tcPr>
+            <w:tcW w:type="dxa" w:w="1584"/>
+            <w:vAlign w:val="center"/>
+            <w:tcBorders>
+              <w:top w:val="single" w:sz="5" w:color="D9D9D9"/>
+              <w:left w:val="single" w:sz="5" w:color="D9D9D9"/>
+              <w:bottom w:val="single" w:sz="5" w:color="D9D9D9"/>
+              <w:right w:val="single" w:sz="5" w:color="D9D9D9"/>
+            </w:tcBorders>
+            <w:shd w:fill="36434B"/>
+            <w:tcMar>
+              <w:top w:w="70" w:type="dxa"/>
+              <w:bottom w:w="70" w:type="dxa"/>
+              <w:left w:w="90" w:type="dxa"/>
+              <w:right w:w="90" w:type="dxa"/>
+            </w:tcMar>
+          </w:tcPr>
+          <w:p>
+            <w:pPr>
+              <w:spacing w:after="0" w:line="245" w:lineRule="auto"/>
+              <w:jc w:val="center"/>
+            </w:pPr>
+            <w:r>
+              <w:rPr>
+                <w:b/>
+                <w:color w:val="FFFFFF"/>
+                <w:sz w:val="20"/>
+              </w:rPr>
+              <w:t>Truth</w:t>
+            </w:r>
+          </w:p>
+        </w:tc>
+        <w:tc>
+          <w:tcPr>
+            <w:tcW w:type="dxa" w:w="1872"/>
+            <w:vAlign w:val="center"/>
+            <w:tcBorders>
+              <w:top w:val="single" w:sz="5" w:color="D9D9D9"/>
+              <w:left w:val="single" w:sz="5" w:color="D9D9D9"/>
+              <w:bottom w:val="single" w:sz="5" w:color="D9D9D9"/>
+              <w:right w:val="single" w:sz="5" w:color="D9D9D9"/>
+            </w:tcBorders>
+            <w:shd w:fill="36434B"/>
+            <w:tcMar>
+              <w:top w:w="70" w:type="dxa"/>
+              <w:bottom w:w="70" w:type="dxa"/>
+              <w:left w:w="90" w:type="dxa"/>
+              <w:right w:w="90" w:type="dxa"/>
+            </w:tcMar>
+          </w:tcPr>
+          <w:p>
+            <w:pPr>
+              <w:spacing w:after="0" w:line="245" w:lineRule="auto"/>
+              <w:jc w:val="center"/>
+            </w:pPr>
+            <w:r>
+              <w:rPr>
+                <w:b/>
+                <w:color w:val="FFFFFF"/>
+                <w:sz w:val="20"/>
+              </w:rPr>
+              <w:t>Improvement 1</w:t>
+            </w:r>
+          </w:p>
+        </w:tc>
+        <w:tc>
+          <w:tcPr>
+            <w:tcW w:type="dxa" w:w="1872"/>
+            <w:vAlign w:val="center"/>
+            <w:tcBorders>
+              <w:top w:val="single" w:sz="5" w:color="D9D9D9"/>
+              <w:left w:val="single" w:sz="5" w:color="D9D9D9"/>
+              <w:bottom w:val="single" w:sz="5" w:color="D9D9D9"/>
+              <w:right w:val="single" w:sz="5" w:color="D9D9D9"/>
+            </w:tcBorders>
+            <w:shd w:fill="36434B"/>
+            <w:tcMar>
+              <w:top w:w="70" w:type="dxa"/>
+              <w:bottom w:w="70" w:type="dxa"/>
+              <w:left w:w="90" w:type="dxa"/>
+              <w:right w:w="90" w:type="dxa"/>
+            </w:tcMar>
+          </w:tcPr>
+          <w:p>
+            <w:pPr>
+              <w:spacing w:after="0" w:line="245" w:lineRule="auto"/>
+              <w:jc w:val="center"/>
+            </w:pPr>
+            <w:r>
+              <w:rPr>
+                <w:b/>
+                <w:color w:val="FFFFFF"/>
+                <w:sz w:val="20"/>
+              </w:rPr>
+              <w:t>Relative error</w:t>
+            </w:r>
+          </w:p>
+        </w:tc>
+      </w:tr>
+      <w:tr>
+        <w:trPr>
+          <w:cantSplit/>
+        </w:trPr>
+        <w:tc>
+          <w:tcPr>
+            <w:tcW w:type="dxa" w:w="4752"/>
+            <w:vAlign w:val="center"/>
+            <w:tcBorders>
+              <w:top w:val="single" w:sz="5" w:color="D9D9D9"/>
+              <w:left w:val="single" w:sz="5" w:color="D9D9D9"/>
+              <w:bottom w:val="single" w:sz="5" w:color="D9D9D9"/>
+              <w:right w:val="single" w:sz="5" w:color="D9D9D9"/>
+            </w:tcBorders>
+            <w:shd w:fill="FFFFFF"/>
+            <w:tcMar>
+              <w:top w:w="70" w:type="dxa"/>
+              <w:bottom w:w="70" w:type="dxa"/>
+              <w:left w:w="90" w:type="dxa"/>
+              <w:right w:w="90" w:type="dxa"/>
+            </w:tcMar>
+          </w:tcPr>
+          <w:p>
+            <w:pPr>
+              <w:spacing w:after="0" w:line="245" w:lineRule="auto"/>
+            </w:pPr>
+            <w:r>
+              <w:rPr>
+                <w:b w:val="0"/>
+                <w:color w:val="000000"/>
+                <w:sz w:val="20"/>
+              </w:rPr>
+              <w:t>Threshold variability  crsd</w:t>
+            </w:r>
+          </w:p>
+        </w:tc>
+        <w:tc>
+          <w:tcPr>
+            <w:tcW w:type="dxa" w:w="1584"/>
+            <w:vAlign w:val="center"/>
+            <w:tcBorders>
+              <w:top w:val="single" w:sz="5" w:color="D9D9D9"/>
+              <w:left w:val="single" w:sz="5" w:color="D9D9D9"/>
+              <w:bottom w:val="single" w:sz="5" w:color="D9D9D9"/>
+              <w:right w:val="single" w:sz="5" w:color="D9D9D9"/>
+            </w:tcBorders>
+            <w:shd w:fill="FFFFFF"/>
+            <w:tcMar>
+              <w:top w:w="70" w:type="dxa"/>
+              <w:bottom w:w="70" w:type="dxa"/>
+              <w:left w:w="90" w:type="dxa"/>
+              <w:right w:w="90" w:type="dxa"/>
+            </w:tcMar>
+          </w:tcPr>
+          <w:p>
+            <w:pPr>
+              <w:spacing w:after="0" w:line="245" w:lineRule="auto"/>
+              <w:jc w:val="center"/>
+            </w:pPr>
+            <w:r>
+              <w:rPr>
+                <w:b w:val="0"/>
+                <w:color w:val="000000"/>
+                <w:sz w:val="20"/>
+              </w:rPr>
+              <w:t>2.000</w:t>
+            </w:r>
+          </w:p>
+        </w:tc>
+        <w:tc>
+          <w:tcPr>
+            <w:tcW w:type="dxa" w:w="1872"/>
+            <w:vAlign w:val="center"/>
+            <w:tcBorders>
+              <w:top w:val="single" w:sz="5" w:color="D9D9D9"/>
+              <w:left w:val="single" w:sz="5" w:color="D9D9D9"/>
+              <w:bottom w:val="single" w:sz="5" w:color="D9D9D9"/>
+              <w:right w:val="single" w:sz="5" w:color="D9D9D9"/>
+            </w:tcBorders>
+            <w:shd w:fill="FFFFFF"/>
+            <w:tcMar>
+              <w:top w:w="70" w:type="dxa"/>
+              <w:bottom w:w="70" w:type="dxa"/>
+              <w:left w:w="90" w:type="dxa"/>
+              <w:right w:w="90" w:type="dxa"/>
+            </w:tcMar>
+          </w:tcPr>
+          <w:p>
+            <w:pPr>
+              <w:spacing w:after="0" w:line="245" w:lineRule="auto"/>
+              <w:jc w:val="center"/>
+            </w:pPr>
+            <w:r>
+              <w:rPr>
+                <w:b w:val="0"/>
+                <w:color w:val="000000"/>
+                <w:sz w:val="20"/>
+              </w:rPr>
+              <w:t>2.333</w:t>
+            </w:r>
+          </w:p>
+        </w:tc>
+        <w:tc>
+          <w:tcPr>
+            <w:tcW w:type="dxa" w:w="1872"/>
+            <w:vAlign w:val="center"/>
+            <w:tcBorders>
+              <w:top w:val="single" w:sz="5" w:color="D9D9D9"/>
+              <w:left w:val="single" w:sz="5" w:color="D9D9D9"/>
+              <w:bottom w:val="single" w:sz="5" w:color="D9D9D9"/>
+              <w:right w:val="single" w:sz="5" w:color="D9D9D9"/>
+            </w:tcBorders>
+            <w:shd w:fill="FFFFFF"/>
+            <w:tcMar>
+              <w:top w:w="70" w:type="dxa"/>
+              <w:bottom w:w="70" w:type="dxa"/>
+              <w:left w:w="90" w:type="dxa"/>
+              <w:right w:w="90" w:type="dxa"/>
+            </w:tcMar>
+          </w:tcPr>
+          <w:p>
+            <w:pPr>
+              <w:spacing w:after="0" w:line="245" w:lineRule="auto"/>
+              <w:jc w:val="center"/>
+            </w:pPr>
+            <w:r>
+              <w:rPr>
+                <w:b w:val="0"/>
+                <w:color w:val="000000"/>
+                <w:sz w:val="20"/>
+              </w:rPr>
+              <w:t>16.63%</w:t>
+            </w:r>
+          </w:p>
+        </w:tc>
+      </w:tr>
+      <w:tr>
+        <w:trPr>
+          <w:cantSplit/>
+        </w:trPr>
+        <w:tc>
+          <w:tcPr>
+            <w:tcW w:type="dxa" w:w="4752"/>
+            <w:vAlign w:val="center"/>
+            <w:tcBorders>
+              <w:top w:val="single" w:sz="5" w:color="D9D9D9"/>
+              <w:left w:val="single" w:sz="5" w:color="D9D9D9"/>
+              <w:bottom w:val="single" w:sz="5" w:color="D9D9D9"/>
+              <w:right w:val="single" w:sz="5" w:color="D9D9D9"/>
+            </w:tcBorders>
+            <w:shd w:fill="F3F5F6"/>
+            <w:tcMar>
+              <w:top w:w="70" w:type="dxa"/>
+              <w:bottom w:w="70" w:type="dxa"/>
+              <w:left w:w="90" w:type="dxa"/>
+              <w:right w:w="90" w:type="dxa"/>
+            </w:tcMar>
+          </w:tcPr>
+          <w:p>
+            <w:pPr>
+              <w:spacing w:after="0" w:line="245" w:lineRule="auto"/>
+            </w:pPr>
+            <w:r>
+              <w:rPr>
+                <w:b w:val="0"/>
+                <w:color w:val="000000"/>
+                <w:sz w:val="20"/>
+              </w:rPr>
+              <w:t>Nondecision-time variability  st</w:t>
+            </w:r>
+          </w:p>
+        </w:tc>
+        <w:tc>
+          <w:tcPr>
+            <w:tcW w:type="dxa" w:w="1584"/>
+            <w:vAlign w:val="center"/>
+            <w:tcBorders>
+              <w:top w:val="single" w:sz="5" w:color="D9D9D9"/>
+              <w:left w:val="single" w:sz="5" w:color="D9D9D9"/>
+              <w:bottom w:val="single" w:sz="5" w:color="D9D9D9"/>
+              <w:right w:val="single" w:sz="5" w:color="D9D9D9"/>
+            </w:tcBorders>
+            <w:shd w:fill="F3F5F6"/>
+            <w:tcMar>
+              <w:top w:w="70" w:type="dxa"/>
+              <w:bottom w:w="70" w:type="dxa"/>
+              <w:left w:w="90" w:type="dxa"/>
+              <w:right w:w="90" w:type="dxa"/>
+            </w:tcMar>
+          </w:tcPr>
+          <w:p>
+            <w:pPr>
+              <w:spacing w:after="0" w:line="245" w:lineRule="auto"/>
+              <w:jc w:val="center"/>
+            </w:pPr>
+            <w:r>
+              <w:rPr>
+                <w:b w:val="0"/>
+                <w:color w:val="000000"/>
+                <w:sz w:val="20"/>
+              </w:rPr>
+              <w:t>50.000</w:t>
+            </w:r>
+          </w:p>
+        </w:tc>
+        <w:tc>
+          <w:tcPr>
+            <w:tcW w:type="dxa" w:w="1872"/>
+            <w:vAlign w:val="center"/>
+            <w:tcBorders>
+              <w:top w:val="single" w:sz="5" w:color="D9D9D9"/>
+              <w:left w:val="single" w:sz="5" w:color="D9D9D9"/>
+              <w:bottom w:val="single" w:sz="5" w:color="D9D9D9"/>
+              <w:right w:val="single" w:sz="5" w:color="D9D9D9"/>
+            </w:tcBorders>
+            <w:shd w:fill="F3F5F6"/>
+            <w:tcMar>
+              <w:top w:w="70" w:type="dxa"/>
+              <w:bottom w:w="70" w:type="dxa"/>
+              <w:left w:w="90" w:type="dxa"/>
+              <w:right w:w="90" w:type="dxa"/>
+            </w:tcMar>
+          </w:tcPr>
+          <w:p>
+            <w:pPr>
+              <w:spacing w:after="0" w:line="245" w:lineRule="auto"/>
+              <w:jc w:val="center"/>
+            </w:pPr>
+            <w:r>
+              <w:rPr>
+                <w:b w:val="0"/>
+                <w:color w:val="000000"/>
+                <w:sz w:val="20"/>
+              </w:rPr>
+              <w:t>54.059</w:t>
+            </w:r>
+          </w:p>
+        </w:tc>
+        <w:tc>
+          <w:tcPr>
+            <w:tcW w:type="dxa" w:w="1872"/>
+            <w:vAlign w:val="center"/>
+            <w:tcBorders>
+              <w:top w:val="single" w:sz="5" w:color="D9D9D9"/>
+              <w:left w:val="single" w:sz="5" w:color="D9D9D9"/>
+              <w:bottom w:val="single" w:sz="5" w:color="D9D9D9"/>
+              <w:right w:val="single" w:sz="5" w:color="D9D9D9"/>
+            </w:tcBorders>
+            <w:shd w:fill="F3F5F6"/>
+            <w:tcMar>
+              <w:top w:w="70" w:type="dxa"/>
+              <w:bottom w:w="70" w:type="dxa"/>
+              <w:left w:w="90" w:type="dxa"/>
+              <w:right w:w="90" w:type="dxa"/>
+            </w:tcMar>
+          </w:tcPr>
+          <w:p>
+            <w:pPr>
+              <w:spacing w:after="0" w:line="245" w:lineRule="auto"/>
+              <w:jc w:val="center"/>
+            </w:pPr>
+            <w:r>
+              <w:rPr>
+                <w:b w:val="0"/>
+                <w:color w:val="000000"/>
+                <w:sz w:val="20"/>
+              </w:rPr>
+              <w:t>8.12%</w:t>
+            </w:r>
+          </w:p>
+        </w:tc>
+      </w:tr>
+      <w:tr>
+        <w:trPr>
+          <w:cantSplit/>
+        </w:trPr>
+        <w:tc>
+          <w:tcPr>
+            <w:tcW w:type="dxa" w:w="4752"/>
+            <w:vAlign w:val="center"/>
+            <w:tcBorders>
+              <w:top w:val="single" w:sz="5" w:color="D9D9D9"/>
+              <w:left w:val="single" w:sz="5" w:color="D9D9D9"/>
+              <w:bottom w:val="single" w:sz="5" w:color="D9D9D9"/>
+              <w:right w:val="single" w:sz="5" w:color="D9D9D9"/>
+            </w:tcBorders>
+            <w:shd w:fill="FFFFFF"/>
+            <w:tcMar>
+              <w:top w:w="70" w:type="dxa"/>
+              <w:bottom w:w="70" w:type="dxa"/>
+              <w:left w:w="90" w:type="dxa"/>
+              <w:right w:w="90" w:type="dxa"/>
+            </w:tcMar>
+          </w:tcPr>
+          <w:p>
+            <w:pPr>
+              <w:spacing w:after="0" w:line="245" w:lineRule="auto"/>
+            </w:pPr>
+            <w:r>
+              <w:rPr>
+                <w:b w:val="0"/>
+                <w:color w:val="000000"/>
+                <w:sz w:val="20"/>
+              </w:rPr>
+              <w:t>One drift strength  av3 in condition 2</w:t>
+            </w:r>
+          </w:p>
+        </w:tc>
+        <w:tc>
+          <w:tcPr>
+            <w:tcW w:type="dxa" w:w="1584"/>
+            <w:vAlign w:val="center"/>
+            <w:tcBorders>
+              <w:top w:val="single" w:sz="5" w:color="D9D9D9"/>
+              <w:left w:val="single" w:sz="5" w:color="D9D9D9"/>
+              <w:bottom w:val="single" w:sz="5" w:color="D9D9D9"/>
+              <w:right w:val="single" w:sz="5" w:color="D9D9D9"/>
+            </w:tcBorders>
+            <w:shd w:fill="FFFFFF"/>
+            <w:tcMar>
+              <w:top w:w="70" w:type="dxa"/>
+              <w:bottom w:w="70" w:type="dxa"/>
+              <w:left w:w="90" w:type="dxa"/>
+              <w:right w:w="90" w:type="dxa"/>
+            </w:tcMar>
+          </w:tcPr>
+          <w:p>
+            <w:pPr>
+              <w:spacing w:after="0" w:line="245" w:lineRule="auto"/>
+              <w:jc w:val="center"/>
+            </w:pPr>
+            <w:r>
+              <w:rPr>
+                <w:b w:val="0"/>
+                <w:color w:val="000000"/>
+                <w:sz w:val="20"/>
+              </w:rPr>
+              <w:t>9.000</w:t>
+            </w:r>
+          </w:p>
+        </w:tc>
+        <w:tc>
+          <w:tcPr>
+            <w:tcW w:type="dxa" w:w="1872"/>
+            <w:vAlign w:val="center"/>
+            <w:tcBorders>
+              <w:top w:val="single" w:sz="5" w:color="D9D9D9"/>
+              <w:left w:val="single" w:sz="5" w:color="D9D9D9"/>
+              <w:bottom w:val="single" w:sz="5" w:color="D9D9D9"/>
+              <w:right w:val="single" w:sz="5" w:color="D9D9D9"/>
+            </w:tcBorders>
+            <w:shd w:fill="FFFFFF"/>
+            <w:tcMar>
+              <w:top w:w="70" w:type="dxa"/>
+              <w:bottom w:w="70" w:type="dxa"/>
+              <w:left w:w="90" w:type="dxa"/>
+              <w:right w:w="90" w:type="dxa"/>
+            </w:tcMar>
+          </w:tcPr>
+          <w:p>
+            <w:pPr>
+              <w:spacing w:after="0" w:line="245" w:lineRule="auto"/>
+              <w:jc w:val="center"/>
+            </w:pPr>
+            <w:r>
+              <w:rPr>
+                <w:b w:val="0"/>
+                <w:color w:val="000000"/>
+                <w:sz w:val="20"/>
+              </w:rPr>
+              <w:t>8.458</w:t>
+            </w:r>
+          </w:p>
+        </w:tc>
+        <w:tc>
+          <w:tcPr>
+            <w:tcW w:type="dxa" w:w="1872"/>
+            <w:vAlign w:val="center"/>
+            <w:tcBorders>
+              <w:top w:val="single" w:sz="5" w:color="D9D9D9"/>
+              <w:left w:val="single" w:sz="5" w:color="D9D9D9"/>
+              <w:bottom w:val="single" w:sz="5" w:color="D9D9D9"/>
+              <w:right w:val="single" w:sz="5" w:color="D9D9D9"/>
+            </w:tcBorders>
+            <w:shd w:fill="FFFFFF"/>
+            <w:tcMar>
+              <w:top w:w="70" w:type="dxa"/>
+              <w:bottom w:w="70" w:type="dxa"/>
+              <w:left w:w="90" w:type="dxa"/>
+              <w:right w:w="90" w:type="dxa"/>
+            </w:tcMar>
+          </w:tcPr>
+          <w:p>
+            <w:pPr>
+              <w:spacing w:after="0" w:line="245" w:lineRule="auto"/>
+              <w:jc w:val="center"/>
+            </w:pPr>
+            <w:r>
+              <w:rPr>
+                <w:b w:val="0"/>
+                <w:color w:val="000000"/>
+                <w:sz w:val="20"/>
+              </w:rPr>
+              <w:t>6.02%</w:t>
+            </w:r>
+          </w:p>
+        </w:tc>
+      </w:tr>
+    </w:tbl>
+    <w:p>
+      <w:pPr>
+        <w:spacing w:after="0"/>
+      </w:pPr>
+    </w:p>
+    <w:p>
+      <w:r>
+        <w:rPr>
+          <w:b w:val="0"/>
+        </w:rPr>
+        <w:t>Other parameters are closer, giving a 4.586% mean. Parameter effects on behavior differ and can interact, so mean parameter distance does not map directly to behavioral mismatch. Adaptation to one fixed training stream and residual parameter errors are plausible explanations; this study does not isolate their contributions or prove another code bug.</w:t>
+      </w:r>
+    </w:p>
+    <w:p>
+      <w:r>
+        <w:rPr>
+          <w:b w:val="0"/>
+        </w:rPr>
+        <w:t>The prediction gate is provisional, not a calibrated significance test. Even the true parameters gave G2 values from 34.3 to 84.1 across only three keys. The failure should be retained honestly, without treating it as proof of a hardware fault or replacing the cutoff after seeing results. Scoring used fresh simulator randomness with the repaired original objective at 9,000 trials per condition; it did not guide fitting and is not held-out participant validation.</w:t>
+      </w:r>
+    </w:p>
+    <w:p>
+      <w:pPr>
+        <w:pStyle w:val="Heading1"/>
+      </w:pPr>
+      <w:r>
+        <w:t>What this study establishes</w:t>
+      </w:r>
+    </w:p>
+    <w:p>
+      <w:r>
+        <w:rPr>
+          <w:b w:val="0"/>
+        </w:rPr>
+        <w:t>One repaired improvement-1 fit met the primary mean recovery target; zero of two arms met the joint gate. A time-to-quality ratio is therefore not estimable. All eight planned jobs have records, including the capped original fit. Both raw traces, all score keys and per-parameter errors are preserved. The guard confirmed exit at 6:46 p.m. Eastern, before the six-hour deadline; no RunPod credits were used. The scientific source was frozen at 322bd1f, with all 84 snapshot files verified. [10]</w:t>
       </w:r>
     </w:p>
     <w:p>
@@ -3504,7 +5678,7 @@
                 <w:color w:val="000000"/>
                 <w:sz w:val="20"/>
               </w:rPr>
-              <w:t>Not established; 0 of 8 laptop fits passed</w:t>
+              <w:t>Latest repair: 1 of 2 arms below 5% mean error; 0 of 2 joint passes. Earlier study: 0 of 8 joint passes</w:t>
             </w:r>
           </w:p>
         </w:tc>
@@ -3537,7 +5711,7 @@
                 <w:color w:val="000000"/>
                 <w:sz w:val="20"/>
               </w:rPr>
-              <w:t>Use identical observations and starts; test larger fitting budgets and multiple starts; compare time to the same accepted quality</w:t>
+              <w:t>Replicate recovery across settings and starts, calibrate prediction tolerances, then compare time to the same accepted quality</w:t>
             </w:r>
           </w:p>
         </w:tc>
@@ -3680,7 +5854,7 @@
         <w:rPr>
           <w:b w:val="0"/>
         </w:rPr>
-        <w:t>Second, implement and test stable mode-indexed coefficient assignment as a separate experimental option. Compare it with the original assignment at matched observations, starts and trial budgets, including a final 9,000-trial optimization stage. Test restarts and removal of the inactive coordinate separately. Retain failures and time-capped cases; do not average only successful fits. [9]</w:t>
+        <w:t>Second, replicate the repaired 9,000-trial recovery test across starts and parameter settings. Compare repaired and historical noise assignment at the same trial budget to isolate the repair's effect. Separately test restarts and removal of the inactive coordinate. Calibrate the prediction criterion using repeated truth simulations and agree practical tolerances with Dr Ratcliff. Retain failures and capped cases; do not average only successful fits. These proposed studies have not been run. [9, 10, 12]</w:t>
       </w:r>
     </w:p>
     <w:p>
@@ -3811,14 +5985,14 @@
           <w:b w:val="0"/>
           <w:sz w:val="20"/>
         </w:rPr>
-        <w:t>Links 1-8 point to the preserved experiment version; link 9 is the later diagnostic addendum. These are implementation and benchmark sources, not a substitute for a research bibliography.</w:t>
+        <w:t>Links 1-8 point to the earlier experiment version; link 9 is the diagnostic addendum. Links 10-12 identify the completed repaired study, source and predeclared plan. These are implementation and benchmark sources, not a substitute for a research bibliography.</w:t>
       </w:r>
     </w:p>
     <w:p>
       <w:pPr>
-        <w:spacing w:after="100"/>
+        <w:spacing w:after="60"/>
       </w:pPr>
-      <w:hyperlink r:id="rId13">
+      <w:hyperlink r:id="rId14">
         <w:r>
           <w:rPr>
             <w:color w:val="24596B"/>
@@ -3829,9 +6003,9 @@
     </w:p>
     <w:p>
       <w:pPr>
-        <w:spacing w:after="100"/>
+        <w:spacing w:after="60"/>
       </w:pPr>
-      <w:hyperlink r:id="rId14">
+      <w:hyperlink r:id="rId15">
         <w:r>
           <w:rPr>
             <w:color w:val="24596B"/>
@@ -3842,9 +6016,9 @@
     </w:p>
     <w:p>
       <w:pPr>
-        <w:spacing w:after="100"/>
+        <w:spacing w:after="60"/>
       </w:pPr>
-      <w:hyperlink r:id="rId15">
+      <w:hyperlink r:id="rId16">
         <w:r>
           <w:rPr>
             <w:color w:val="24596B"/>
@@ -3855,9 +6029,9 @@
     </w:p>
     <w:p>
       <w:pPr>
-        <w:spacing w:after="100"/>
+        <w:spacing w:after="60"/>
       </w:pPr>
-      <w:hyperlink r:id="rId16">
+      <w:hyperlink r:id="rId17">
         <w:r>
           <w:rPr>
             <w:color w:val="24596B"/>
@@ -3868,9 +6042,9 @@
     </w:p>
     <w:p>
       <w:pPr>
-        <w:spacing w:after="100"/>
+        <w:spacing w:after="60"/>
       </w:pPr>
-      <w:hyperlink r:id="rId17">
+      <w:hyperlink r:id="rId18">
         <w:r>
           <w:rPr>
             <w:color w:val="24596B"/>
@@ -3881,9 +6055,9 @@
     </w:p>
     <w:p>
       <w:pPr>
-        <w:spacing w:after="100"/>
+        <w:spacing w:after="60"/>
       </w:pPr>
-      <w:hyperlink r:id="rId18">
+      <w:hyperlink r:id="rId19">
         <w:r>
           <w:rPr>
             <w:color w:val="24596B"/>
@@ -3894,9 +6068,9 @@
     </w:p>
     <w:p>
       <w:pPr>
-        <w:spacing w:after="100"/>
+        <w:spacing w:after="60"/>
       </w:pPr>
-      <w:hyperlink r:id="rId19">
+      <w:hyperlink r:id="rId20">
         <w:r>
           <w:rPr>
             <w:color w:val="24596B"/>
@@ -3907,9 +6081,9 @@
     </w:p>
     <w:p>
       <w:pPr>
-        <w:spacing w:after="100"/>
+        <w:spacing w:after="60"/>
       </w:pPr>
-      <w:hyperlink r:id="rId20">
+      <w:hyperlink r:id="rId21">
         <w:r>
           <w:rPr>
             <w:color w:val="24596B"/>
@@ -3920,9 +6094,9 @@
     </w:p>
     <w:p>
       <w:pPr>
-        <w:spacing w:after="100"/>
+        <w:spacing w:after="60"/>
       </w:pPr>
-      <w:hyperlink r:id="rId21">
+      <w:hyperlink r:id="rId22">
         <w:r>
           <w:rPr>
             <w:color w:val="24596B"/>
@@ -3932,12 +6106,51 @@
       </w:hyperlink>
     </w:p>
     <w:p>
+      <w:pPr>
+        <w:spacing w:after="60"/>
+      </w:pPr>
+      <w:hyperlink r:id="rId23">
+        <w:r>
+          <w:rPr>
+            <w:color w:val="24596B"/>
+          </w:rPr>
+          <w:t>[10] Completed repaired K-L study and verified raw archive</w:t>
+        </w:r>
+      </w:hyperlink>
+    </w:p>
+    <w:p>
+      <w:pPr>
+        <w:spacing w:after="60"/>
+      </w:pPr>
+      <w:hyperlink r:id="rId24">
+        <w:r>
+          <w:rPr>
+            <w:color w:val="24596B"/>
+          </w:rPr>
+          <w:t>[11] Repaired K-L component identity and conjugate orientation</w:t>
+        </w:r>
+      </w:hyperlink>
+    </w:p>
+    <w:p>
+      <w:pPr>
+        <w:spacing w:after="60"/>
+      </w:pPr>
+      <w:hyperlink r:id="rId25">
+        <w:r>
+          <w:rPr>
+            <w:color w:val="24596B"/>
+          </w:rPr>
+          <w:t>[12] Predeclared repaired recovery plan and prediction gate</w:t>
+        </w:r>
+      </w:hyperlink>
+    </w:p>
+    <w:p>
       <w:r>
         <w:rPr>
           <w:b w:val="0"/>
           <w:sz w:val="19"/>
         </w:rPr>
-        <w:t>The H100 and laptop raw archives retain settings, seeds, proposal traces, source snapshots and SHA-256 manifests. The laptop audit verified all 25 GPU-worker records, all eight returned fit vectors against their scores, all 9,216 paired trial comparisons, and both archive/file hashes. GitHub archive contents were independently downloaded and hash-checked after upload. The laptop experiment finished within the authorized limit; no new GPU experiment was run to prepare these documents.</w:t>
+        <w:t>Archives preserve settings, seeds, traces, source snapshots and SHA-256 manifests. The repaired study's 688,438-byte archive has 47 verified entries, all 649 fitting evaluations and three scoring keys. Both attempts are preserved, and the uploaded results were verified at cc2dbea. The raw files include guard evidence confirming that the benchmark processes stopped.</w:t>
       </w:r>
     </w:p>
     <w:sectPr>

</xml_diff>

<commit_message>
docs: remove proposed validation sequence from Ratcliff report
</commit_message>
<xml_diff>
--- a/docs/briefs/2026-10-15-model-b/Model_B_Methods_and_Validation_Report.docx
+++ b/docs/briefs/2026-10-15-model-b/Model_B_Methods_and_Validation_Report.docx
@@ -5826,46 +5826,6 @@
       </w:pPr>
     </w:p>
     <w:p>
-      <w:pPr>
-        <w:pStyle w:val="Heading1"/>
-      </w:pPr>
-      <w:r>
-        <w:t>Recommended next validation sequence</w:t>
-      </w:r>
-    </w:p>
-    <w:p>
-      <w:r>
-        <w:rPr>
-          <w:b w:val="0"/>
-        </w:rPr>
-        <w:t>First, run a parameter-grid recovery and boundary-case study of the stopping path against its paired full-horizon control, and statistical comparisons with the original simulator. Use enough trials in rare response categories to assess the agreed RT and choice margins.</w:t>
-      </w:r>
-    </w:p>
-    <w:p>
-      <w:r>
-        <w:rPr>
-          <w:b w:val="0"/>
-        </w:rPr>
-        <w:t>A concrete starting proposal is ten agreed parameter settings, twelve seeds and 9,000 trials per condition: 2.16 million paired trial comparisons across two conditions. Repeat warmed timing seven times per setting and report first-use costs separately. This proposed study has not been run; expand it if rare categories or parameter limits remain unresolved.</w:t>
-      </w:r>
-    </w:p>
-    <w:p>
-      <w:r>
-        <w:rPr>
-          <w:b w:val="0"/>
-        </w:rPr>
-        <w:t>Second, replicate the repaired 9,000-trial recovery test across starts and parameter settings. Compare repaired and historical noise assignment at the same trial budget to isolate the repair's effect. Separately test restarts and removal of the inactive coordinate. Calibrate the prediction criterion using repeated truth simulations and agree practical tolerances with Dr Ratcliff. Retain failures and capped cases; do not average only successful fits. These proposed studies have not been run. [9, 10, 12]</w:t>
-      </w:r>
-    </w:p>
-    <w:p>
-      <w:r>
-        <w:rPr>
-          <w:b w:val="0"/>
-        </w:rPr>
-        <w:t>Finally, repeat performance measurements on the frozen implementation and assess real participant data if it becomes available for this project. A simulation-methods paper can focus on faster forward simulation with validated output fidelity. A claim of faster accurate fitting needs the additional recovery result. We can draft the model, algorithm and current benchmark sections now.</w:t>
-      </w:r>
-    </w:p>
-    <w:p>
       <w:r>
         <w:rPr>
           <w:b w:val="0"/>

</xml_diff>